<commit_message>
Addition of teensy example and milestone on routing completed, missing a few components to connect
</commit_message>
<xml_diff>
--- a/Documentation/CID_RocketPower_Rev00_WIP.docx
+++ b/Documentation/CID_RocketPower_Rev00_WIP.docx
@@ -605,12 +605,21 @@
           <w:lang w:val="en-CA"/>
         </w:rPr>
         <w:pict w14:anchorId="2A55A2F2">
-          <v:rect id="_x0000_i1415" style="width:0;height:1.5pt" o:hralign="center" o:hrstd="t" o:hr="t" fillcolor="#a0a0a0" stroked="f"/>
+          <v:rect id="_x0000_i1026" style="width:0;height:1.5pt" o:hralign="center" o:hrstd="t" o:hr="t" fillcolor="#a0a0a0" stroked="f"/>
         </w:pict>
       </w:r>
     </w:p>
     <w:sdt>
       <w:sdtPr>
+        <w:rPr>
+          <w:rFonts w:asciiTheme="minorHAnsi" w:eastAsiaTheme="minorHAnsi" w:hAnsiTheme="minorHAnsi" w:cstheme="minorBidi"/>
+          <w:color w:val="auto"/>
+          <w:kern w:val="2"/>
+          <w:sz w:val="22"/>
+          <w:szCs w:val="22"/>
+          <w:lang w:val="fr-FR"/>
+          <w14:ligatures w14:val="standardContextual"/>
+        </w:rPr>
         <w:id w:val="2045400871"/>
         <w:docPartObj>
           <w:docPartGallery w:val="Table of Contents"/>
@@ -619,16 +628,9 @@
       </w:sdtPr>
       <w:sdtEndPr>
         <w:rPr>
-          <w:rFonts w:asciiTheme="minorHAnsi" w:eastAsiaTheme="minorHAnsi" w:hAnsiTheme="minorHAnsi" w:cstheme="minorBidi"/>
           <w:b/>
           <w:bCs/>
           <w:noProof/>
-          <w:color w:val="auto"/>
-          <w:kern w:val="2"/>
-          <w:sz w:val="22"/>
-          <w:szCs w:val="22"/>
-          <w:lang w:val="fr-FR"/>
-          <w14:ligatures w14:val="standardContextual"/>
         </w:rPr>
       </w:sdtEndPr>
       <w:sdtContent>
@@ -738,23 +740,7 @@
                 <w:noProof/>
                 <w:lang w:val="en-CA"/>
               </w:rPr>
-              <w:t>1. Introdu</w:t>
-            </w:r>
-            <w:r>
-              <w:rPr>
-                <w:rStyle w:val="Hyperlink"/>
-                <w:noProof/>
-                <w:lang w:val="en-CA"/>
-              </w:rPr>
-              <w:t>c</w:t>
-            </w:r>
-            <w:r>
-              <w:rPr>
-                <w:rStyle w:val="Hyperlink"/>
-                <w:noProof/>
-                <w:lang w:val="en-CA"/>
-              </w:rPr>
-              <w:t>tion</w:t>
+              <w:t>1. Introduction</w:t>
             </w:r>
             <w:r>
               <w:rPr>
@@ -2841,7 +2827,7 @@
           <w:lang w:val="en-CA"/>
         </w:rPr>
         <w:pict w14:anchorId="3258EFD0">
-          <v:rect id="_x0000_i1416" style="width:0;height:1.5pt" o:hralign="center" o:hrstd="t" o:hr="t" fillcolor="#a0a0a0" stroked="f"/>
+          <v:rect id="_x0000_i1027" style="width:0;height:1.5pt" o:hralign="center" o:hrstd="t" o:hr="t" fillcolor="#a0a0a0" stroked="f"/>
         </w:pict>
       </w:r>
     </w:p>
@@ -3512,7 +3498,7 @@
           <w:lang w:val="en-CA"/>
         </w:rPr>
         <w:pict w14:anchorId="18F4C67F">
-          <v:rect id="_x0000_i1417" style="width:0;height:1.5pt" o:hralign="center" o:hrstd="t" o:hr="t" fillcolor="#a0a0a0" stroked="f"/>
+          <v:rect id="_x0000_i1028" style="width:0;height:1.5pt" o:hralign="center" o:hrstd="t" o:hr="t" fillcolor="#a0a0a0" stroked="f"/>
         </w:pict>
       </w:r>
     </w:p>
@@ -3766,6 +3752,7 @@
       <w:r>
         <w:rPr>
           <w:rFonts w:ascii="Times New Roman" w:hAnsi="Times New Roman" w:cs="Times New Roman"/>
+          <w:noProof/>
           <w:lang w:val="en-CA"/>
         </w:rPr>
         <w:drawing>
@@ -3784,7 +3771,7 @@
                     <pic:cNvPicPr/>
                   </pic:nvPicPr>
                   <pic:blipFill>
-                    <a:blip r:embed="rId6"/>
+                    <a:blip r:embed="rId8"/>
                     <a:stretch>
                       <a:fillRect/>
                     </a:stretch>
@@ -3818,7 +3805,7 @@
           <w:lang w:val="en-CA"/>
         </w:rPr>
         <w:pict w14:anchorId="016FB801">
-          <v:rect id="_x0000_i1418" style="width:0;height:1.5pt" o:hralign="center" o:hrstd="t" o:hr="t" fillcolor="#a0a0a0" stroked="f"/>
+          <v:rect id="_x0000_i1029" style="width:0;height:1.5pt" o:hralign="center" o:hrstd="t" o:hr="t" fillcolor="#a0a0a0" stroked="f"/>
         </w:pict>
       </w:r>
     </w:p>
@@ -3875,8 +3862,8 @@
         <w:tblLook w:val="04A0" w:firstRow="1" w:lastRow="0" w:firstColumn="1" w:lastColumn="0" w:noHBand="0" w:noVBand="1"/>
       </w:tblPr>
       <w:tblGrid>
-        <w:gridCol w:w="2783"/>
-        <w:gridCol w:w="6257"/>
+        <w:gridCol w:w="3307"/>
+        <w:gridCol w:w="5733"/>
       </w:tblGrid>
       <w:tr>
         <w:trPr>
@@ -4039,21 +4026,7 @@
                 <w:rFonts w:ascii="Times New Roman" w:hAnsi="Times New Roman" w:cs="Times New Roman"/>
                 <w:lang w:val="en-CA"/>
               </w:rPr>
-              <w:t>XT30UPB</w:t>
-            </w:r>
-            <w:r>
-              <w:rPr>
-                <w:rFonts w:ascii="Times New Roman" w:hAnsi="Times New Roman" w:cs="Times New Roman"/>
-                <w:lang w:val="en-CA"/>
-              </w:rPr>
-              <w:t>-F</w:t>
-            </w:r>
-            <w:r>
-              <w:rPr>
-                <w:rFonts w:ascii="Times New Roman" w:hAnsi="Times New Roman" w:cs="Times New Roman"/>
-                <w:lang w:val="en-CA"/>
-              </w:rPr>
-              <w:t xml:space="preserve"> (PCB-mounted female)</w:t>
+              <w:t>Screw terminal</w:t>
             </w:r>
           </w:p>
         </w:tc>
@@ -4330,7 +4303,7 @@
                 <w:rFonts w:ascii="Times New Roman" w:hAnsi="Times New Roman" w:cs="Times New Roman"/>
                 <w:lang w:val="en-CA"/>
               </w:rPr>
-              <w:t>5V</w:t>
+              <w:t>+7.5V</w:t>
             </w:r>
           </w:p>
         </w:tc>
@@ -4352,7 +4325,7 @@
                 <w:rFonts w:ascii="Times New Roman" w:hAnsi="Times New Roman" w:cs="Times New Roman"/>
                 <w:lang w:val="en-CA"/>
               </w:rPr>
-              <w:t>5.0 V</w:t>
+              <w:t>Battery voltage</w:t>
             </w:r>
           </w:p>
         </w:tc>
@@ -4374,14 +4347,273 @@
                 <w:rFonts w:ascii="Times New Roman" w:hAnsi="Times New Roman" w:cs="Times New Roman"/>
                 <w:lang w:val="en-CA"/>
               </w:rPr>
-              <w:t>External modules, peripherals</w:t>
+              <w:t>Pyrotechnic firing power</w:t>
+            </w:r>
+            <w:r>
+              <w:rPr>
+                <w:rFonts w:ascii="Times New Roman" w:hAnsi="Times New Roman" w:cs="Times New Roman"/>
+                <w:lang w:val="en-CA"/>
+              </w:rPr>
+              <w:t xml:space="preserve"> and servos</w:t>
+            </w:r>
+          </w:p>
+        </w:tc>
+      </w:tr>
+    </w:tbl>
+    <w:p>
+      <w:pPr>
+        <w:rPr>
+          <w:rFonts w:ascii="Times New Roman" w:hAnsi="Times New Roman" w:cs="Times New Roman"/>
+          <w:lang w:val="en-CA"/>
+        </w:rPr>
+      </w:pPr>
+    </w:p>
+    <w:p>
+      <w:pPr>
+        <w:pStyle w:val="Heading2"/>
+        <w:rPr>
+          <w:lang w:val="en-CA"/>
+        </w:rPr>
+      </w:pPr>
+      <w:r>
+        <w:rPr>
+          <w:lang w:val="en-CA"/>
+        </w:rPr>
+        <w:lastRenderedPageBreak/>
+        <w:t xml:space="preserve">3.3 Current consumption </w:t>
+      </w:r>
+      <w:r>
+        <w:rPr>
+          <w:lang w:val="en-CA"/>
+        </w:rPr>
+        <w:t>7.4</w:t>
+      </w:r>
+      <w:r>
+        <w:rPr>
+          <w:lang w:val="en-CA"/>
+        </w:rPr>
+        <w:t xml:space="preserve">v </w:t>
+      </w:r>
+      <w:r>
+        <w:rPr>
+          <w:lang w:val="en-CA"/>
+        </w:rPr>
+        <w:t>rail</w:t>
+      </w:r>
+    </w:p>
+    <w:tbl>
+      <w:tblPr>
+        <w:tblpPr w:leftFromText="180" w:rightFromText="180" w:vertAnchor="text" w:horzAnchor="margin" w:tblpY="130"/>
+        <w:tblW w:w="9209" w:type="dxa"/>
+        <w:tblCellSpacing w:w="15" w:type="dxa"/>
+        <w:tblBorders>
+          <w:top w:val="single" w:sz="4" w:space="0" w:color="auto"/>
+          <w:left w:val="single" w:sz="4" w:space="0" w:color="auto"/>
+          <w:bottom w:val="single" w:sz="4" w:space="0" w:color="auto"/>
+          <w:right w:val="single" w:sz="4" w:space="0" w:color="auto"/>
+          <w:insideH w:val="single" w:sz="4" w:space="0" w:color="auto"/>
+          <w:insideV w:val="single" w:sz="4" w:space="0" w:color="auto"/>
+        </w:tblBorders>
+        <w:tblCellMar>
+          <w:top w:w="15" w:type="dxa"/>
+          <w:left w:w="15" w:type="dxa"/>
+          <w:bottom w:w="15" w:type="dxa"/>
+          <w:right w:w="15" w:type="dxa"/>
+        </w:tblCellMar>
+        <w:tblLook w:val="04A0" w:firstRow="1" w:lastRow="0" w:firstColumn="1" w:lastColumn="0" w:noHBand="0" w:noVBand="1"/>
+      </w:tblPr>
+      <w:tblGrid>
+        <w:gridCol w:w="3603"/>
+        <w:gridCol w:w="541"/>
+        <w:gridCol w:w="1521"/>
+        <w:gridCol w:w="1560"/>
+        <w:gridCol w:w="1984"/>
+      </w:tblGrid>
+      <w:tr>
+        <w:trPr>
+          <w:trHeight w:val="462"/>
+          <w:tblHeader/>
+          <w:tblCellSpacing w:w="15" w:type="dxa"/>
+        </w:trPr>
+        <w:tc>
+          <w:tcPr>
+            <w:tcW w:w="0" w:type="auto"/>
+            <w:hideMark/>
+          </w:tcPr>
+          <w:p>
+            <w:pPr>
+              <w:rPr>
+                <w:rFonts w:ascii="Times New Roman" w:hAnsi="Times New Roman" w:cs="Times New Roman"/>
+                <w:b/>
+                <w:bCs/>
+                <w:lang w:val="en-CA"/>
+              </w:rPr>
+            </w:pPr>
+            <w:r>
+              <w:rPr>
+                <w:rFonts w:ascii="Times New Roman" w:hAnsi="Times New Roman" w:cs="Times New Roman"/>
+                <w:b/>
+                <w:bCs/>
+                <w:lang w:val="en-CA"/>
+              </w:rPr>
+              <w:t>Component</w:t>
+            </w:r>
+          </w:p>
+        </w:tc>
+        <w:tc>
+          <w:tcPr>
+            <w:tcW w:w="0" w:type="auto"/>
+            <w:hideMark/>
+          </w:tcPr>
+          <w:p>
+            <w:pPr>
+              <w:jc w:val="center"/>
+              <w:rPr>
+                <w:rFonts w:ascii="Times New Roman" w:hAnsi="Times New Roman" w:cs="Times New Roman"/>
+                <w:b/>
+                <w:bCs/>
+                <w:lang w:val="en-CA"/>
+              </w:rPr>
+            </w:pPr>
+            <w:r>
+              <w:rPr>
+                <w:rFonts w:ascii="Times New Roman" w:hAnsi="Times New Roman" w:cs="Times New Roman"/>
+                <w:b/>
+                <w:bCs/>
+                <w:lang w:val="en-CA"/>
+              </w:rPr>
+              <w:t>Qty</w:t>
+            </w:r>
+          </w:p>
+        </w:tc>
+        <w:tc>
+          <w:tcPr>
+            <w:tcW w:w="1491" w:type="dxa"/>
+            <w:hideMark/>
+          </w:tcPr>
+          <w:p>
+            <w:pPr>
+              <w:jc w:val="center"/>
+              <w:rPr>
+                <w:rFonts w:ascii="Times New Roman" w:hAnsi="Times New Roman" w:cs="Times New Roman"/>
+                <w:b/>
+                <w:bCs/>
+                <w:lang w:val="en-CA"/>
+              </w:rPr>
+            </w:pPr>
+            <w:r>
+              <w:rPr>
+                <w:rFonts w:ascii="Times New Roman" w:hAnsi="Times New Roman" w:cs="Times New Roman"/>
+                <w:b/>
+                <w:bCs/>
+                <w:lang w:val="en-CA"/>
+              </w:rPr>
+              <w:t xml:space="preserve">Max </w:t>
+            </w:r>
+            <w:proofErr w:type="spellStart"/>
+            <w:r>
+              <w:rPr>
+                <w:rFonts w:ascii="Times New Roman" w:hAnsi="Times New Roman" w:cs="Times New Roman"/>
+                <w:b/>
+                <w:bCs/>
+                <w:lang w:val="en-CA"/>
+              </w:rPr>
+              <w:t>curr</w:t>
+            </w:r>
+            <w:proofErr w:type="spellEnd"/>
+            <w:r>
+              <w:rPr>
+                <w:rFonts w:ascii="Times New Roman" w:hAnsi="Times New Roman" w:cs="Times New Roman"/>
+                <w:b/>
+                <w:bCs/>
+                <w:lang w:val="en-CA"/>
+              </w:rPr>
+              <w:t>/</w:t>
+            </w:r>
+            <w:r>
+              <w:rPr>
+                <w:rFonts w:ascii="Times New Roman" w:hAnsi="Times New Roman" w:cs="Times New Roman"/>
+                <w:b/>
+                <w:bCs/>
+                <w:lang w:val="en-CA"/>
+              </w:rPr>
+              <w:t>unit</w:t>
+            </w:r>
+          </w:p>
+        </w:tc>
+        <w:tc>
+          <w:tcPr>
+            <w:tcW w:w="1530" w:type="dxa"/>
+          </w:tcPr>
+          <w:p>
+            <w:pPr>
+              <w:jc w:val="center"/>
+              <w:rPr>
+                <w:rFonts w:ascii="Times New Roman" w:hAnsi="Times New Roman" w:cs="Times New Roman"/>
+                <w:b/>
+                <w:bCs/>
+                <w:lang w:val="en-CA"/>
+              </w:rPr>
+            </w:pPr>
+            <w:r>
+              <w:rPr>
+                <w:rFonts w:ascii="Times New Roman" w:hAnsi="Times New Roman" w:cs="Times New Roman"/>
+                <w:b/>
+                <w:bCs/>
+                <w:lang w:val="en-CA"/>
+              </w:rPr>
+              <w:t xml:space="preserve">Max </w:t>
+            </w:r>
+            <w:proofErr w:type="spellStart"/>
+            <w:r>
+              <w:rPr>
+                <w:rFonts w:ascii="Times New Roman" w:hAnsi="Times New Roman" w:cs="Times New Roman"/>
+                <w:b/>
+                <w:bCs/>
+                <w:lang w:val="en-CA"/>
+              </w:rPr>
+              <w:t>curr</w:t>
+            </w:r>
+            <w:proofErr w:type="spellEnd"/>
+            <w:r>
+              <w:rPr>
+                <w:rFonts w:ascii="Times New Roman" w:hAnsi="Times New Roman" w:cs="Times New Roman"/>
+                <w:b/>
+                <w:bCs/>
+                <w:lang w:val="en-CA"/>
+              </w:rPr>
+              <w:t xml:space="preserve"> total</w:t>
+            </w:r>
+          </w:p>
+        </w:tc>
+        <w:tc>
+          <w:tcPr>
+            <w:tcW w:w="1939" w:type="dxa"/>
+          </w:tcPr>
+          <w:p>
+            <w:pPr>
+              <w:rPr>
+                <w:rFonts w:ascii="Times New Roman" w:hAnsi="Times New Roman" w:cs="Times New Roman"/>
+                <w:b/>
+                <w:bCs/>
+                <w:lang w:val="en-CA"/>
+              </w:rPr>
+            </w:pPr>
+            <w:r>
+              <w:rPr>
+                <w:rFonts w:ascii="Times New Roman" w:hAnsi="Times New Roman" w:cs="Times New Roman"/>
+                <w:b/>
+                <w:bCs/>
+                <w:lang w:val="en-CA"/>
+              </w:rPr>
+              <w:t>Note</w:t>
             </w:r>
           </w:p>
         </w:tc>
       </w:tr>
       <w:tr>
         <w:trPr>
-          <w:trHeight w:val="469"/>
+          <w:trHeight w:val="462"/>
           <w:tblCellSpacing w:w="15" w:type="dxa"/>
         </w:trPr>
         <w:tc>
@@ -4402,8 +4634,7 @@
                 <w:rFonts w:ascii="Times New Roman" w:hAnsi="Times New Roman" w:cs="Times New Roman"/>
                 <w:lang w:val="en-CA"/>
               </w:rPr>
-              <w:lastRenderedPageBreak/>
-              <w:t>+7.5V</w:t>
+              <w:t>Blue Bird BMS-101HV servo</w:t>
             </w:r>
           </w:p>
         </w:tc>
@@ -4415,20 +4646,113 @@
           </w:tcPr>
           <w:p>
             <w:pPr>
-              <w:rPr>
-                <w:rFonts w:ascii="Times New Roman" w:hAnsi="Times New Roman" w:cs="Times New Roman"/>
-                <w:lang w:val="en-CA"/>
-              </w:rPr>
-            </w:pPr>
-            <w:r>
-              <w:rPr>
-                <w:rFonts w:ascii="Times New Roman" w:hAnsi="Times New Roman" w:cs="Times New Roman"/>
-                <w:lang w:val="en-CA"/>
-              </w:rPr>
-              <w:t>Battery voltage</w:t>
-            </w:r>
-          </w:p>
-        </w:tc>
+              <w:jc w:val="center"/>
+              <w:rPr>
+                <w:rFonts w:ascii="Times New Roman" w:hAnsi="Times New Roman" w:cs="Times New Roman"/>
+                <w:lang w:val="en-CA"/>
+              </w:rPr>
+            </w:pPr>
+            <w:r>
+              <w:rPr>
+                <w:rFonts w:ascii="Times New Roman" w:hAnsi="Times New Roman" w:cs="Times New Roman"/>
+                <w:lang w:val="en-CA"/>
+              </w:rPr>
+              <w:t>4</w:t>
+            </w:r>
+          </w:p>
+        </w:tc>
+        <w:tc>
+          <w:tcPr>
+            <w:tcW w:w="1491" w:type="dxa"/>
+            <w:vAlign w:val="center"/>
+            <w:hideMark/>
+          </w:tcPr>
+          <w:p>
+            <w:pPr>
+              <w:jc w:val="center"/>
+              <w:rPr>
+                <w:rFonts w:ascii="Times New Roman" w:hAnsi="Times New Roman" w:cs="Times New Roman"/>
+                <w:lang w:val="en-CA"/>
+              </w:rPr>
+            </w:pPr>
+            <w:r>
+              <w:rPr>
+                <w:rFonts w:ascii="Times New Roman" w:hAnsi="Times New Roman" w:cs="Times New Roman"/>
+                <w:lang w:val="en-CA"/>
+              </w:rPr>
+              <w:t>0.5</w:t>
+            </w:r>
+            <w:r>
+              <w:rPr>
+                <w:rFonts w:ascii="Times New Roman" w:hAnsi="Times New Roman" w:cs="Times New Roman"/>
+                <w:lang w:val="en-CA"/>
+              </w:rPr>
+              <w:t xml:space="preserve"> A</w:t>
+            </w:r>
+          </w:p>
+        </w:tc>
+        <w:tc>
+          <w:tcPr>
+            <w:tcW w:w="1530" w:type="dxa"/>
+            <w:vAlign w:val="center"/>
+          </w:tcPr>
+          <w:p>
+            <w:pPr>
+              <w:jc w:val="center"/>
+              <w:rPr>
+                <w:rFonts w:ascii="Times New Roman" w:hAnsi="Times New Roman" w:cs="Times New Roman"/>
+                <w:lang w:val="en-CA"/>
+              </w:rPr>
+            </w:pPr>
+            <w:r>
+              <w:rPr>
+                <w:rFonts w:ascii="Times New Roman" w:hAnsi="Times New Roman" w:cs="Times New Roman"/>
+                <w:lang w:val="en-CA"/>
+              </w:rPr>
+              <w:t>2</w:t>
+            </w:r>
+            <w:r>
+              <w:rPr>
+                <w:rFonts w:ascii="Times New Roman" w:hAnsi="Times New Roman" w:cs="Times New Roman"/>
+                <w:lang w:val="en-CA"/>
+              </w:rPr>
+              <w:t xml:space="preserve"> </w:t>
+            </w:r>
+            <w:r>
+              <w:rPr>
+                <w:rFonts w:ascii="Times New Roman" w:hAnsi="Times New Roman" w:cs="Times New Roman"/>
+                <w:lang w:val="en-CA"/>
+              </w:rPr>
+              <w:t>A</w:t>
+            </w:r>
+          </w:p>
+        </w:tc>
+        <w:tc>
+          <w:tcPr>
+            <w:tcW w:w="1939" w:type="dxa"/>
+          </w:tcPr>
+          <w:p>
+            <w:pPr>
+              <w:rPr>
+                <w:rFonts w:ascii="Times New Roman" w:hAnsi="Times New Roman" w:cs="Times New Roman"/>
+                <w:lang w:val="en-CA"/>
+              </w:rPr>
+            </w:pPr>
+            <w:r>
+              <w:rPr>
+                <w:rFonts w:ascii="Times New Roman" w:hAnsi="Times New Roman" w:cs="Times New Roman"/>
+                <w:lang w:val="en-CA"/>
+              </w:rPr>
+              <w:t>Current stall has been measured through RD6012 power supply, no official documentation.</w:t>
+            </w:r>
+          </w:p>
+        </w:tc>
+      </w:tr>
+      <w:tr>
+        <w:trPr>
+          <w:trHeight w:val="462"/>
+          <w:tblCellSpacing w:w="15" w:type="dxa"/>
+        </w:trPr>
         <w:tc>
           <w:tcPr>
             <w:tcW w:w="0" w:type="auto"/>
@@ -4442,19 +4766,689 @@
                 <w:lang w:val="en-CA"/>
               </w:rPr>
             </w:pPr>
-            <w:r>
-              <w:rPr>
-                <w:rFonts w:ascii="Times New Roman" w:hAnsi="Times New Roman" w:cs="Times New Roman"/>
-                <w:lang w:val="en-CA"/>
-              </w:rPr>
-              <w:t>Pyrotechnic firing power</w:t>
-            </w:r>
-            <w:r>
-              <w:rPr>
-                <w:rFonts w:ascii="Times New Roman" w:hAnsi="Times New Roman" w:cs="Times New Roman"/>
-                <w:lang w:val="en-CA"/>
-              </w:rPr>
-              <w:t xml:space="preserve"> and servos</w:t>
+            <w:proofErr w:type="spellStart"/>
+            <w:r>
+              <w:rPr>
+                <w:rFonts w:ascii="Times New Roman" w:hAnsi="Times New Roman" w:cs="Times New Roman"/>
+                <w:lang w:val="en-CA"/>
+              </w:rPr>
+              <w:t>RunCam</w:t>
+            </w:r>
+            <w:proofErr w:type="spellEnd"/>
+            <w:r>
+              <w:rPr>
+                <w:rFonts w:ascii="Times New Roman" w:hAnsi="Times New Roman" w:cs="Times New Roman"/>
+                <w:lang w:val="en-CA"/>
+              </w:rPr>
+              <w:t xml:space="preserve"> Split 4-25</w:t>
+            </w:r>
+          </w:p>
+        </w:tc>
+        <w:tc>
+          <w:tcPr>
+            <w:tcW w:w="0" w:type="auto"/>
+            <w:vAlign w:val="center"/>
+            <w:hideMark/>
+          </w:tcPr>
+          <w:p>
+            <w:pPr>
+              <w:jc w:val="center"/>
+              <w:rPr>
+                <w:rFonts w:ascii="Times New Roman" w:hAnsi="Times New Roman" w:cs="Times New Roman"/>
+                <w:lang w:val="en-CA"/>
+              </w:rPr>
+            </w:pPr>
+            <w:r>
+              <w:rPr>
+                <w:rFonts w:ascii="Times New Roman" w:hAnsi="Times New Roman" w:cs="Times New Roman"/>
+                <w:lang w:val="en-CA"/>
+              </w:rPr>
+              <w:t>1</w:t>
+            </w:r>
+          </w:p>
+        </w:tc>
+        <w:tc>
+          <w:tcPr>
+            <w:tcW w:w="1491" w:type="dxa"/>
+            <w:vAlign w:val="center"/>
+            <w:hideMark/>
+          </w:tcPr>
+          <w:p>
+            <w:pPr>
+              <w:jc w:val="center"/>
+              <w:rPr>
+                <w:rFonts w:ascii="Times New Roman" w:hAnsi="Times New Roman" w:cs="Times New Roman"/>
+                <w:lang w:val="en-CA"/>
+              </w:rPr>
+            </w:pPr>
+            <w:r>
+              <w:rPr>
+                <w:rFonts w:ascii="Times New Roman" w:hAnsi="Times New Roman" w:cs="Times New Roman"/>
+                <w:lang w:val="en-CA"/>
+              </w:rPr>
+              <w:t>450</w:t>
+            </w:r>
+            <w:r>
+              <w:rPr>
+                <w:rFonts w:ascii="Times New Roman" w:hAnsi="Times New Roman" w:cs="Times New Roman"/>
+                <w:lang w:val="en-CA"/>
+              </w:rPr>
+              <w:t xml:space="preserve"> </w:t>
+            </w:r>
+            <w:r>
+              <w:rPr>
+                <w:rFonts w:ascii="Times New Roman" w:hAnsi="Times New Roman" w:cs="Times New Roman"/>
+                <w:lang w:val="en-CA"/>
+              </w:rPr>
+              <w:t>mA</w:t>
+            </w:r>
+          </w:p>
+        </w:tc>
+        <w:tc>
+          <w:tcPr>
+            <w:tcW w:w="1530" w:type="dxa"/>
+            <w:vAlign w:val="center"/>
+          </w:tcPr>
+          <w:p>
+            <w:pPr>
+              <w:jc w:val="center"/>
+              <w:rPr>
+                <w:rFonts w:ascii="Times New Roman" w:hAnsi="Times New Roman" w:cs="Times New Roman"/>
+                <w:lang w:val="en-CA"/>
+              </w:rPr>
+            </w:pPr>
+            <w:r>
+              <w:rPr>
+                <w:rFonts w:ascii="Times New Roman" w:hAnsi="Times New Roman" w:cs="Times New Roman"/>
+                <w:lang w:val="en-CA"/>
+              </w:rPr>
+              <w:t>450</w:t>
+            </w:r>
+            <w:r>
+              <w:rPr>
+                <w:rFonts w:ascii="Times New Roman" w:hAnsi="Times New Roman" w:cs="Times New Roman"/>
+                <w:lang w:val="en-CA"/>
+              </w:rPr>
+              <w:t xml:space="preserve"> </w:t>
+            </w:r>
+            <w:r>
+              <w:rPr>
+                <w:rFonts w:ascii="Times New Roman" w:hAnsi="Times New Roman" w:cs="Times New Roman"/>
+                <w:lang w:val="en-CA"/>
+              </w:rPr>
+              <w:t>mA</w:t>
+            </w:r>
+          </w:p>
+        </w:tc>
+        <w:tc>
+          <w:tcPr>
+            <w:tcW w:w="1939" w:type="dxa"/>
+          </w:tcPr>
+          <w:p>
+            <w:pPr>
+              <w:rPr>
+                <w:rFonts w:ascii="Times New Roman" w:hAnsi="Times New Roman" w:cs="Times New Roman"/>
+                <w:lang w:val="en-CA"/>
+              </w:rPr>
+            </w:pPr>
+            <w:r>
+              <w:rPr>
+                <w:rFonts w:ascii="Times New Roman" w:hAnsi="Times New Roman" w:cs="Times New Roman"/>
+                <w:lang w:val="en-CA"/>
+              </w:rPr>
+              <w:t>At 5v</w:t>
+            </w:r>
+          </w:p>
+        </w:tc>
+      </w:tr>
+      <w:tr>
+        <w:trPr>
+          <w:trHeight w:val="462"/>
+          <w:tblCellSpacing w:w="15" w:type="dxa"/>
+        </w:trPr>
+        <w:tc>
+          <w:tcPr>
+            <w:tcW w:w="0" w:type="auto"/>
+            <w:vAlign w:val="center"/>
+          </w:tcPr>
+          <w:p>
+            <w:pPr>
+              <w:rPr>
+                <w:rFonts w:ascii="Times New Roman" w:hAnsi="Times New Roman" w:cs="Times New Roman"/>
+                <w:lang w:val="en-CA"/>
+              </w:rPr>
+            </w:pPr>
+            <w:r>
+              <w:rPr>
+                <w:rFonts w:ascii="Times New Roman" w:hAnsi="Times New Roman" w:cs="Times New Roman"/>
+                <w:lang w:val="en-CA"/>
+              </w:rPr>
+              <w:t>E-match 89866</w:t>
+            </w:r>
+          </w:p>
+        </w:tc>
+        <w:tc>
+          <w:tcPr>
+            <w:tcW w:w="0" w:type="auto"/>
+            <w:vAlign w:val="center"/>
+          </w:tcPr>
+          <w:p>
+            <w:pPr>
+              <w:jc w:val="center"/>
+              <w:rPr>
+                <w:rFonts w:ascii="Times New Roman" w:hAnsi="Times New Roman" w:cs="Times New Roman"/>
+                <w:lang w:val="en-CA"/>
+              </w:rPr>
+            </w:pPr>
+            <w:r>
+              <w:rPr>
+                <w:rFonts w:ascii="Times New Roman" w:hAnsi="Times New Roman" w:cs="Times New Roman"/>
+                <w:lang w:val="en-CA"/>
+              </w:rPr>
+              <w:t>3</w:t>
+            </w:r>
+          </w:p>
+        </w:tc>
+        <w:tc>
+          <w:tcPr>
+            <w:tcW w:w="1491" w:type="dxa"/>
+            <w:vAlign w:val="center"/>
+          </w:tcPr>
+          <w:p>
+            <w:pPr>
+              <w:jc w:val="center"/>
+              <w:rPr>
+                <w:rFonts w:ascii="Times New Roman" w:hAnsi="Times New Roman" w:cs="Times New Roman"/>
+                <w:lang w:val="en-CA"/>
+              </w:rPr>
+            </w:pPr>
+            <w:r>
+              <w:rPr>
+                <w:rFonts w:ascii="Times New Roman" w:hAnsi="Times New Roman" w:cs="Times New Roman"/>
+                <w:lang w:val="en-CA"/>
+              </w:rPr>
+              <w:t>1 A</w:t>
+            </w:r>
+          </w:p>
+        </w:tc>
+        <w:tc>
+          <w:tcPr>
+            <w:tcW w:w="1530" w:type="dxa"/>
+            <w:vAlign w:val="center"/>
+          </w:tcPr>
+          <w:p>
+            <w:pPr>
+              <w:jc w:val="center"/>
+              <w:rPr>
+                <w:rFonts w:ascii="Times New Roman" w:hAnsi="Times New Roman" w:cs="Times New Roman"/>
+                <w:lang w:val="en-CA"/>
+              </w:rPr>
+            </w:pPr>
+            <w:r>
+              <w:rPr>
+                <w:rFonts w:ascii="Times New Roman" w:hAnsi="Times New Roman" w:cs="Times New Roman"/>
+                <w:lang w:val="en-CA"/>
+              </w:rPr>
+              <w:t>1 A</w:t>
+            </w:r>
+          </w:p>
+        </w:tc>
+        <w:tc>
+          <w:tcPr>
+            <w:tcW w:w="1939" w:type="dxa"/>
+          </w:tcPr>
+          <w:p>
+            <w:pPr>
+              <w:rPr>
+                <w:rFonts w:ascii="Times New Roman" w:hAnsi="Times New Roman" w:cs="Times New Roman"/>
+                <w:lang w:val="en-CA"/>
+              </w:rPr>
+            </w:pPr>
+            <w:r>
+              <w:rPr>
+                <w:rFonts w:ascii="Times New Roman" w:hAnsi="Times New Roman" w:cs="Times New Roman"/>
+                <w:lang w:val="en-CA"/>
+              </w:rPr>
+              <w:t>Used once at a time</w:t>
+            </w:r>
+          </w:p>
+        </w:tc>
+      </w:tr>
+      <w:tr>
+        <w:trPr>
+          <w:trHeight w:val="462"/>
+          <w:tblCellSpacing w:w="15" w:type="dxa"/>
+        </w:trPr>
+        <w:tc>
+          <w:tcPr>
+            <w:tcW w:w="0" w:type="auto"/>
+            <w:vAlign w:val="center"/>
+          </w:tcPr>
+          <w:p>
+            <w:pPr>
+              <w:rPr>
+                <w:rFonts w:ascii="Times New Roman" w:hAnsi="Times New Roman" w:cs="Times New Roman"/>
+                <w:lang w:val="en-CA"/>
+              </w:rPr>
+            </w:pPr>
+            <w:r>
+              <w:rPr>
+                <w:rFonts w:ascii="Times New Roman" w:hAnsi="Times New Roman" w:cs="Times New Roman"/>
+                <w:lang w:val="en-CA"/>
+              </w:rPr>
+              <w:t>3.3v rail</w:t>
+            </w:r>
+          </w:p>
+        </w:tc>
+        <w:tc>
+          <w:tcPr>
+            <w:tcW w:w="0" w:type="auto"/>
+            <w:vAlign w:val="center"/>
+          </w:tcPr>
+          <w:p>
+            <w:pPr>
+              <w:jc w:val="center"/>
+              <w:rPr>
+                <w:rFonts w:ascii="Times New Roman" w:hAnsi="Times New Roman" w:cs="Times New Roman"/>
+                <w:lang w:val="en-CA"/>
+              </w:rPr>
+            </w:pPr>
+            <w:r>
+              <w:rPr>
+                <w:rFonts w:ascii="Times New Roman" w:hAnsi="Times New Roman" w:cs="Times New Roman"/>
+                <w:lang w:val="en-CA"/>
+              </w:rPr>
+              <w:t>1</w:t>
+            </w:r>
+          </w:p>
+        </w:tc>
+        <w:tc>
+          <w:tcPr>
+            <w:tcW w:w="1491" w:type="dxa"/>
+            <w:vAlign w:val="center"/>
+          </w:tcPr>
+          <w:p>
+            <w:pPr>
+              <w:jc w:val="center"/>
+              <w:rPr>
+                <w:rFonts w:ascii="Times New Roman" w:hAnsi="Times New Roman" w:cs="Times New Roman"/>
+                <w:lang w:val="en-CA"/>
+              </w:rPr>
+            </w:pPr>
+            <w:r>
+              <w:rPr>
+                <w:rFonts w:ascii="Times New Roman" w:hAnsi="Times New Roman" w:cs="Times New Roman"/>
+              </w:rPr>
+              <w:t>388.295 mA</w:t>
+            </w:r>
+          </w:p>
+        </w:tc>
+        <w:tc>
+          <w:tcPr>
+            <w:tcW w:w="1530" w:type="dxa"/>
+            <w:vAlign w:val="center"/>
+          </w:tcPr>
+          <w:p>
+            <w:pPr>
+              <w:jc w:val="center"/>
+              <w:rPr>
+                <w:rFonts w:ascii="Times New Roman" w:hAnsi="Times New Roman" w:cs="Times New Roman"/>
+                <w:lang w:val="en-CA"/>
+              </w:rPr>
+            </w:pPr>
+            <w:r>
+              <w:rPr>
+                <w:rFonts w:ascii="Times New Roman" w:hAnsi="Times New Roman" w:cs="Times New Roman"/>
+              </w:rPr>
+              <w:t>388.295 mA</w:t>
+            </w:r>
+          </w:p>
+        </w:tc>
+        <w:tc>
+          <w:tcPr>
+            <w:tcW w:w="1939" w:type="dxa"/>
+          </w:tcPr>
+          <w:p>
+            <w:pPr>
+              <w:rPr>
+                <w:rFonts w:ascii="Times New Roman" w:hAnsi="Times New Roman" w:cs="Times New Roman"/>
+                <w:lang w:val="en-CA"/>
+              </w:rPr>
+            </w:pPr>
+          </w:p>
+        </w:tc>
+      </w:tr>
+      <w:tr>
+        <w:trPr>
+          <w:trHeight w:val="462"/>
+          <w:tblCellSpacing w:w="15" w:type="dxa"/>
+        </w:trPr>
+        <w:tc>
+          <w:tcPr>
+            <w:tcW w:w="0" w:type="auto"/>
+            <w:vAlign w:val="center"/>
+          </w:tcPr>
+          <w:p>
+            <w:pPr>
+              <w:rPr>
+                <w:rFonts w:ascii="Times New Roman" w:hAnsi="Times New Roman" w:cs="Times New Roman"/>
+                <w:b/>
+                <w:bCs/>
+                <w:lang w:val="en-CA"/>
+              </w:rPr>
+            </w:pPr>
+            <w:r>
+              <w:rPr>
+                <w:rFonts w:ascii="Times New Roman" w:hAnsi="Times New Roman" w:cs="Times New Roman"/>
+                <w:b/>
+                <w:bCs/>
+                <w:lang w:val="en-CA"/>
+              </w:rPr>
+              <w:t>Total</w:t>
+            </w:r>
+            <w:r>
+              <w:rPr>
+                <w:rFonts w:ascii="Times New Roman" w:hAnsi="Times New Roman" w:cs="Times New Roman"/>
+                <w:b/>
+                <w:bCs/>
+                <w:lang w:val="en-CA"/>
+              </w:rPr>
+              <w:t xml:space="preserve"> (50% Margin of Safety) </w:t>
+            </w:r>
+          </w:p>
+        </w:tc>
+        <w:tc>
+          <w:tcPr>
+            <w:tcW w:w="0" w:type="auto"/>
+            <w:vAlign w:val="center"/>
+          </w:tcPr>
+          <w:p>
+            <w:pPr>
+              <w:jc w:val="center"/>
+              <w:rPr>
+                <w:rFonts w:ascii="Times New Roman" w:hAnsi="Times New Roman" w:cs="Times New Roman"/>
+                <w:lang w:val="en-CA"/>
+              </w:rPr>
+            </w:pPr>
+          </w:p>
+        </w:tc>
+        <w:tc>
+          <w:tcPr>
+            <w:tcW w:w="1491" w:type="dxa"/>
+            <w:vAlign w:val="center"/>
+          </w:tcPr>
+          <w:p>
+            <w:pPr>
+              <w:jc w:val="center"/>
+              <w:rPr>
+                <w:rFonts w:ascii="Times New Roman" w:hAnsi="Times New Roman" w:cs="Times New Roman"/>
+              </w:rPr>
+            </w:pPr>
+          </w:p>
+        </w:tc>
+        <w:tc>
+          <w:tcPr>
+            <w:tcW w:w="1530" w:type="dxa"/>
+            <w:vAlign w:val="center"/>
+          </w:tcPr>
+          <w:p>
+            <w:pPr>
+              <w:jc w:val="center"/>
+              <w:rPr>
+                <w:rFonts w:ascii="Times New Roman" w:hAnsi="Times New Roman" w:cs="Times New Roman"/>
+              </w:rPr>
+            </w:pPr>
+            <w:r>
+              <w:rPr>
+                <w:rFonts w:ascii="Times New Roman" w:hAnsi="Times New Roman" w:cs="Times New Roman"/>
+              </w:rPr>
+              <w:t xml:space="preserve">5.75 </w:t>
+            </w:r>
+            <w:r>
+              <w:rPr>
+                <w:rFonts w:ascii="Times New Roman" w:hAnsi="Times New Roman" w:cs="Times New Roman"/>
+              </w:rPr>
+              <w:t>A</w:t>
+            </w:r>
+          </w:p>
+        </w:tc>
+        <w:tc>
+          <w:tcPr>
+            <w:tcW w:w="1939" w:type="dxa"/>
+          </w:tcPr>
+          <w:p>
+            <w:pPr>
+              <w:spacing w:line="240" w:lineRule="auto"/>
+              <w:rPr>
+                <w:rFonts w:ascii="Times New Roman" w:hAnsi="Times New Roman" w:cs="Times New Roman"/>
+                <w:lang w:val="en-CA"/>
+              </w:rPr>
+            </w:pPr>
+            <w:r>
+              <w:rPr>
+                <w:rFonts w:ascii="Times New Roman" w:hAnsi="Times New Roman" w:cs="Times New Roman"/>
+                <w:lang w:val="en-CA"/>
+              </w:rPr>
+              <w:t>Trace width:</w:t>
+            </w:r>
+          </w:p>
+          <w:p>
+            <w:pPr>
+              <w:spacing w:line="240" w:lineRule="auto"/>
+              <w:rPr>
+                <w:rFonts w:ascii="Times New Roman" w:hAnsi="Times New Roman" w:cs="Times New Roman"/>
+                <w:lang w:val="en-CA"/>
+              </w:rPr>
+            </w:pPr>
+            <w:r>
+              <w:rPr>
+                <w:rFonts w:ascii="Times New Roman" w:hAnsi="Times New Roman" w:cs="Times New Roman"/>
+                <w:lang w:val="en-CA"/>
+              </w:rPr>
+              <w:t>1 oz/ft</w:t>
+            </w:r>
+            <w:r>
+              <w:rPr>
+                <w:rFonts w:ascii="Times New Roman" w:hAnsi="Times New Roman" w:cs="Times New Roman"/>
+                <w:vertAlign w:val="superscript"/>
+                <w:lang w:val="en-CA"/>
+              </w:rPr>
+              <w:t>2</w:t>
+            </w:r>
+            <w:r>
+              <w:rPr>
+                <w:rFonts w:ascii="Times New Roman" w:hAnsi="Times New Roman" w:cs="Times New Roman"/>
+                <w:vertAlign w:val="superscript"/>
+                <w:lang w:val="en-CA"/>
+              </w:rPr>
+              <w:t xml:space="preserve"> </w:t>
+            </w:r>
+            <w:r>
+              <w:rPr>
+                <w:rFonts w:ascii="Times New Roman" w:hAnsi="Times New Roman" w:cs="Times New Roman"/>
+                <w:lang w:val="en-CA"/>
+              </w:rPr>
+              <w:t>= 225mil</w:t>
+            </w:r>
+          </w:p>
+          <w:p>
+            <w:pPr>
+              <w:spacing w:line="240" w:lineRule="auto"/>
+              <w:rPr>
+                <w:rFonts w:ascii="Times New Roman" w:hAnsi="Times New Roman" w:cs="Times New Roman"/>
+                <w:lang w:val="en-CA"/>
+              </w:rPr>
+            </w:pPr>
+            <w:r>
+              <w:rPr>
+                <w:rFonts w:ascii="Times New Roman" w:hAnsi="Times New Roman" w:cs="Times New Roman"/>
+                <w:lang w:val="en-CA"/>
+              </w:rPr>
+              <w:t>2</w:t>
+            </w:r>
+            <w:r>
+              <w:rPr>
+                <w:rFonts w:ascii="Times New Roman" w:hAnsi="Times New Roman" w:cs="Times New Roman"/>
+                <w:lang w:val="en-CA"/>
+              </w:rPr>
+              <w:t xml:space="preserve"> oz/ft</w:t>
+            </w:r>
+            <w:r>
+              <w:rPr>
+                <w:rFonts w:ascii="Times New Roman" w:hAnsi="Times New Roman" w:cs="Times New Roman"/>
+                <w:vertAlign w:val="superscript"/>
+                <w:lang w:val="en-CA"/>
+              </w:rPr>
+              <w:t>2</w:t>
+            </w:r>
+            <w:r>
+              <w:rPr>
+                <w:rFonts w:ascii="Times New Roman" w:hAnsi="Times New Roman" w:cs="Times New Roman"/>
+                <w:vertAlign w:val="superscript"/>
+                <w:lang w:val="en-CA"/>
+              </w:rPr>
+              <w:t xml:space="preserve"> </w:t>
+            </w:r>
+            <w:r>
+              <w:rPr>
+                <w:rFonts w:ascii="Times New Roman" w:hAnsi="Times New Roman" w:cs="Times New Roman"/>
+                <w:lang w:val="en-CA"/>
+              </w:rPr>
+              <w:t xml:space="preserve">= </w:t>
+            </w:r>
+            <w:r>
+              <w:rPr>
+                <w:rFonts w:ascii="Times New Roman" w:hAnsi="Times New Roman" w:cs="Times New Roman"/>
+                <w:lang w:val="en-CA"/>
+              </w:rPr>
+              <w:t>113</w:t>
+            </w:r>
+            <w:r>
+              <w:rPr>
+                <w:rFonts w:ascii="Times New Roman" w:hAnsi="Times New Roman" w:cs="Times New Roman"/>
+                <w:lang w:val="en-CA"/>
+              </w:rPr>
+              <w:t>mil</w:t>
+            </w:r>
+          </w:p>
+          <w:p>
+            <w:pPr>
+              <w:spacing w:line="240" w:lineRule="auto"/>
+              <w:rPr>
+                <w:rFonts w:ascii="Times New Roman" w:hAnsi="Times New Roman" w:cs="Times New Roman"/>
+                <w:lang w:val="en-CA"/>
+              </w:rPr>
+            </w:pPr>
+            <w:r>
+              <w:rPr>
+                <w:rFonts w:ascii="Times New Roman" w:hAnsi="Times New Roman" w:cs="Times New Roman"/>
+                <w:lang w:val="en-CA"/>
+              </w:rPr>
+              <w:t>3</w:t>
+            </w:r>
+            <w:r>
+              <w:rPr>
+                <w:rFonts w:ascii="Times New Roman" w:hAnsi="Times New Roman" w:cs="Times New Roman"/>
+                <w:lang w:val="en-CA"/>
+              </w:rPr>
+              <w:t xml:space="preserve"> oz/ft</w:t>
+            </w:r>
+            <w:r>
+              <w:rPr>
+                <w:rFonts w:ascii="Times New Roman" w:hAnsi="Times New Roman" w:cs="Times New Roman"/>
+                <w:vertAlign w:val="superscript"/>
+                <w:lang w:val="en-CA"/>
+              </w:rPr>
+              <w:t>2</w:t>
+            </w:r>
+            <w:r>
+              <w:rPr>
+                <w:rFonts w:ascii="Times New Roman" w:hAnsi="Times New Roman" w:cs="Times New Roman"/>
+                <w:vertAlign w:val="superscript"/>
+                <w:lang w:val="en-CA"/>
+              </w:rPr>
+              <w:t xml:space="preserve"> </w:t>
+            </w:r>
+            <w:r>
+              <w:rPr>
+                <w:rFonts w:ascii="Times New Roman" w:hAnsi="Times New Roman" w:cs="Times New Roman"/>
+                <w:lang w:val="en-CA"/>
+              </w:rPr>
+              <w:t xml:space="preserve">= </w:t>
+            </w:r>
+            <w:r>
+              <w:rPr>
+                <w:rFonts w:ascii="Times New Roman" w:hAnsi="Times New Roman" w:cs="Times New Roman"/>
+                <w:lang w:val="en-CA"/>
+              </w:rPr>
+              <w:t>75</w:t>
+            </w:r>
+            <w:r>
+              <w:rPr>
+                <w:rFonts w:ascii="Times New Roman" w:hAnsi="Times New Roman" w:cs="Times New Roman"/>
+                <w:lang w:val="en-CA"/>
+              </w:rPr>
+              <w:t>mil</w:t>
+            </w:r>
+          </w:p>
+          <w:p>
+            <w:pPr>
+              <w:spacing w:line="240" w:lineRule="auto"/>
+              <w:rPr>
+                <w:rFonts w:ascii="Times New Roman" w:hAnsi="Times New Roman" w:cs="Times New Roman"/>
+                <w:lang w:val="en-CA"/>
+              </w:rPr>
+            </w:pPr>
+            <w:r>
+              <w:rPr>
+                <w:rFonts w:ascii="Times New Roman" w:hAnsi="Times New Roman" w:cs="Times New Roman"/>
+                <w:lang w:val="en-CA"/>
+              </w:rPr>
+              <w:t>4</w:t>
+            </w:r>
+            <w:r>
+              <w:rPr>
+                <w:rFonts w:ascii="Times New Roman" w:hAnsi="Times New Roman" w:cs="Times New Roman"/>
+                <w:lang w:val="en-CA"/>
+              </w:rPr>
+              <w:t xml:space="preserve"> oz/ft</w:t>
+            </w:r>
+            <w:r>
+              <w:rPr>
+                <w:rFonts w:ascii="Times New Roman" w:hAnsi="Times New Roman" w:cs="Times New Roman"/>
+                <w:vertAlign w:val="superscript"/>
+                <w:lang w:val="en-CA"/>
+              </w:rPr>
+              <w:t>2</w:t>
+            </w:r>
+            <w:r>
+              <w:rPr>
+                <w:rFonts w:ascii="Times New Roman" w:hAnsi="Times New Roman" w:cs="Times New Roman"/>
+                <w:vertAlign w:val="superscript"/>
+                <w:lang w:val="en-CA"/>
+              </w:rPr>
+              <w:t xml:space="preserve"> </w:t>
+            </w:r>
+            <w:r>
+              <w:rPr>
+                <w:rFonts w:ascii="Times New Roman" w:hAnsi="Times New Roman" w:cs="Times New Roman"/>
+                <w:lang w:val="en-CA"/>
+              </w:rPr>
+              <w:t xml:space="preserve">= </w:t>
+            </w:r>
+            <w:r>
+              <w:rPr>
+                <w:rFonts w:ascii="Times New Roman" w:hAnsi="Times New Roman" w:cs="Times New Roman"/>
+                <w:lang w:val="en-CA"/>
+              </w:rPr>
+              <w:t>56</w:t>
+            </w:r>
+            <w:r>
+              <w:rPr>
+                <w:rFonts w:ascii="Times New Roman" w:hAnsi="Times New Roman" w:cs="Times New Roman"/>
+                <w:lang w:val="en-CA"/>
+              </w:rPr>
+              <w:t>mil</w:t>
             </w:r>
           </w:p>
         </w:tc>
@@ -4464,22 +5458,1786 @@
       <w:pPr>
         <w:rPr>
           <w:rFonts w:ascii="Times New Roman" w:hAnsi="Times New Roman" w:cs="Times New Roman"/>
-          <w:lang w:val="en-CA"/>
-        </w:rPr>
-      </w:pPr>
-      <w:r>
-        <w:rPr>
-          <w:rFonts w:ascii="Times New Roman" w:hAnsi="Times New Roman" w:cs="Times New Roman"/>
-          <w:lang w:val="en-CA"/>
-        </w:rPr>
-        <w:pict w14:anchorId="35F2A4E1">
-          <v:rect id="_x0000_i1419" style="width:0;height:1.5pt" o:hralign="center" o:hrstd="t" o:hr="t" fillcolor="#a0a0a0" stroked="f"/>
-        </w:pict>
+          <w:sz w:val="18"/>
+          <w:szCs w:val="18"/>
+          <w:lang w:val="en-CA"/>
+        </w:rPr>
+      </w:pPr>
+      <w:r>
+        <w:rPr>
+          <w:rFonts w:ascii="Times New Roman" w:hAnsi="Times New Roman" w:cs="Times New Roman"/>
+          <w:sz w:val="18"/>
+          <w:szCs w:val="18"/>
+          <w:lang w:val="en-CA"/>
+        </w:rPr>
+        <w:t>*Assuming a 20 degrees Celsius temperature rise and inner power layer</w:t>
       </w:r>
     </w:p>
     <w:p>
       <w:pPr>
+        <w:pStyle w:val="Heading2"/>
+        <w:rPr>
+          <w:lang w:val="en-CA"/>
+        </w:rPr>
+      </w:pPr>
+      <w:r>
+        <w:rPr>
+          <w:lang w:val="en-CA"/>
+        </w:rPr>
+        <w:t xml:space="preserve">3.4 Current consumption </w:t>
+      </w:r>
+      <w:r>
+        <w:rPr>
+          <w:lang w:val="en-CA"/>
+        </w:rPr>
+        <w:t>3.3</w:t>
+      </w:r>
+      <w:r>
+        <w:rPr>
+          <w:lang w:val="en-CA"/>
+        </w:rPr>
+        <w:t>v rail</w:t>
+      </w:r>
+    </w:p>
+    <w:tbl>
+      <w:tblPr>
+        <w:tblpPr w:leftFromText="180" w:rightFromText="180" w:vertAnchor="text" w:horzAnchor="margin" w:tblpY="130"/>
+        <w:tblW w:w="9209" w:type="dxa"/>
+        <w:tblCellSpacing w:w="15" w:type="dxa"/>
+        <w:tblBorders>
+          <w:top w:val="single" w:sz="4" w:space="0" w:color="auto"/>
+          <w:left w:val="single" w:sz="4" w:space="0" w:color="auto"/>
+          <w:bottom w:val="single" w:sz="4" w:space="0" w:color="auto"/>
+          <w:right w:val="single" w:sz="4" w:space="0" w:color="auto"/>
+          <w:insideH w:val="single" w:sz="4" w:space="0" w:color="auto"/>
+          <w:insideV w:val="single" w:sz="4" w:space="0" w:color="auto"/>
+        </w:tblBorders>
+        <w:tblCellMar>
+          <w:top w:w="15" w:type="dxa"/>
+          <w:left w:w="15" w:type="dxa"/>
+          <w:bottom w:w="15" w:type="dxa"/>
+          <w:right w:w="15" w:type="dxa"/>
+        </w:tblCellMar>
+        <w:tblLook w:val="04A0" w:firstRow="1" w:lastRow="0" w:firstColumn="1" w:lastColumn="0" w:noHBand="0" w:noVBand="1"/>
+      </w:tblPr>
+      <w:tblGrid>
+        <w:gridCol w:w="3603"/>
+        <w:gridCol w:w="541"/>
+        <w:gridCol w:w="1521"/>
+        <w:gridCol w:w="1560"/>
+        <w:gridCol w:w="1984"/>
+      </w:tblGrid>
+      <w:tr>
+        <w:trPr>
+          <w:trHeight w:val="462"/>
+          <w:tblHeader/>
+          <w:tblCellSpacing w:w="15" w:type="dxa"/>
+        </w:trPr>
+        <w:tc>
+          <w:tcPr>
+            <w:tcW w:w="0" w:type="auto"/>
+            <w:hideMark/>
+          </w:tcPr>
+          <w:p>
+            <w:pPr>
+              <w:rPr>
+                <w:rFonts w:ascii="Times New Roman" w:hAnsi="Times New Roman" w:cs="Times New Roman"/>
+                <w:b/>
+                <w:bCs/>
+                <w:lang w:val="en-CA"/>
+              </w:rPr>
+            </w:pPr>
+            <w:r>
+              <w:rPr>
+                <w:rFonts w:ascii="Times New Roman" w:hAnsi="Times New Roman" w:cs="Times New Roman"/>
+                <w:b/>
+                <w:bCs/>
+                <w:lang w:val="en-CA"/>
+              </w:rPr>
+              <w:t>Component</w:t>
+            </w:r>
+          </w:p>
+        </w:tc>
+        <w:tc>
+          <w:tcPr>
+            <w:tcW w:w="0" w:type="auto"/>
+            <w:hideMark/>
+          </w:tcPr>
+          <w:p>
+            <w:pPr>
+              <w:jc w:val="center"/>
+              <w:rPr>
+                <w:rFonts w:ascii="Times New Roman" w:hAnsi="Times New Roman" w:cs="Times New Roman"/>
+                <w:b/>
+                <w:bCs/>
+                <w:lang w:val="en-CA"/>
+              </w:rPr>
+            </w:pPr>
+            <w:r>
+              <w:rPr>
+                <w:rFonts w:ascii="Times New Roman" w:hAnsi="Times New Roman" w:cs="Times New Roman"/>
+                <w:b/>
+                <w:bCs/>
+                <w:lang w:val="en-CA"/>
+              </w:rPr>
+              <w:t>Qty</w:t>
+            </w:r>
+          </w:p>
+        </w:tc>
+        <w:tc>
+          <w:tcPr>
+            <w:tcW w:w="1491" w:type="dxa"/>
+            <w:hideMark/>
+          </w:tcPr>
+          <w:p>
+            <w:pPr>
+              <w:jc w:val="center"/>
+              <w:rPr>
+                <w:rFonts w:ascii="Times New Roman" w:hAnsi="Times New Roman" w:cs="Times New Roman"/>
+                <w:b/>
+                <w:bCs/>
+                <w:lang w:val="en-CA"/>
+              </w:rPr>
+            </w:pPr>
+            <w:r>
+              <w:rPr>
+                <w:rFonts w:ascii="Times New Roman" w:hAnsi="Times New Roman" w:cs="Times New Roman"/>
+                <w:b/>
+                <w:bCs/>
+                <w:lang w:val="en-CA"/>
+              </w:rPr>
+              <w:t xml:space="preserve">Max </w:t>
+            </w:r>
+            <w:proofErr w:type="spellStart"/>
+            <w:r>
+              <w:rPr>
+                <w:rFonts w:ascii="Times New Roman" w:hAnsi="Times New Roman" w:cs="Times New Roman"/>
+                <w:b/>
+                <w:bCs/>
+                <w:lang w:val="en-CA"/>
+              </w:rPr>
+              <w:t>curr</w:t>
+            </w:r>
+            <w:proofErr w:type="spellEnd"/>
+            <w:r>
+              <w:rPr>
+                <w:rFonts w:ascii="Times New Roman" w:hAnsi="Times New Roman" w:cs="Times New Roman"/>
+                <w:b/>
+                <w:bCs/>
+                <w:lang w:val="en-CA"/>
+              </w:rPr>
+              <w:t>/</w:t>
+            </w:r>
+            <w:r>
+              <w:rPr>
+                <w:rFonts w:ascii="Times New Roman" w:hAnsi="Times New Roman" w:cs="Times New Roman"/>
+                <w:b/>
+                <w:bCs/>
+                <w:lang w:val="en-CA"/>
+              </w:rPr>
+              <w:t>unit</w:t>
+            </w:r>
+          </w:p>
+        </w:tc>
+        <w:tc>
+          <w:tcPr>
+            <w:tcW w:w="1530" w:type="dxa"/>
+          </w:tcPr>
+          <w:p>
+            <w:pPr>
+              <w:jc w:val="center"/>
+              <w:rPr>
+                <w:rFonts w:ascii="Times New Roman" w:hAnsi="Times New Roman" w:cs="Times New Roman"/>
+                <w:b/>
+                <w:bCs/>
+                <w:lang w:val="en-CA"/>
+              </w:rPr>
+            </w:pPr>
+            <w:r>
+              <w:rPr>
+                <w:rFonts w:ascii="Times New Roman" w:hAnsi="Times New Roman" w:cs="Times New Roman"/>
+                <w:b/>
+                <w:bCs/>
+                <w:lang w:val="en-CA"/>
+              </w:rPr>
+              <w:t xml:space="preserve">Max </w:t>
+            </w:r>
+            <w:proofErr w:type="spellStart"/>
+            <w:r>
+              <w:rPr>
+                <w:rFonts w:ascii="Times New Roman" w:hAnsi="Times New Roman" w:cs="Times New Roman"/>
+                <w:b/>
+                <w:bCs/>
+                <w:lang w:val="en-CA"/>
+              </w:rPr>
+              <w:t>curr</w:t>
+            </w:r>
+            <w:proofErr w:type="spellEnd"/>
+            <w:r>
+              <w:rPr>
+                <w:rFonts w:ascii="Times New Roman" w:hAnsi="Times New Roman" w:cs="Times New Roman"/>
+                <w:b/>
+                <w:bCs/>
+                <w:lang w:val="en-CA"/>
+              </w:rPr>
+              <w:t xml:space="preserve"> total</w:t>
+            </w:r>
+          </w:p>
+        </w:tc>
+        <w:tc>
+          <w:tcPr>
+            <w:tcW w:w="1939" w:type="dxa"/>
+          </w:tcPr>
+          <w:p>
+            <w:pPr>
+              <w:rPr>
+                <w:rFonts w:ascii="Times New Roman" w:hAnsi="Times New Roman" w:cs="Times New Roman"/>
+                <w:b/>
+                <w:bCs/>
+                <w:lang w:val="en-CA"/>
+              </w:rPr>
+            </w:pPr>
+            <w:r>
+              <w:rPr>
+                <w:rFonts w:ascii="Times New Roman" w:hAnsi="Times New Roman" w:cs="Times New Roman"/>
+                <w:b/>
+                <w:bCs/>
+                <w:lang w:val="en-CA"/>
+              </w:rPr>
+              <w:t>Note</w:t>
+            </w:r>
+          </w:p>
+        </w:tc>
+      </w:tr>
+      <w:tr>
+        <w:trPr>
+          <w:trHeight w:val="462"/>
+          <w:tblCellSpacing w:w="15" w:type="dxa"/>
+        </w:trPr>
+        <w:tc>
+          <w:tcPr>
+            <w:tcW w:w="0" w:type="auto"/>
+            <w:vAlign w:val="center"/>
+            <w:hideMark/>
+          </w:tcPr>
+          <w:p>
+            <w:pPr>
+              <w:rPr>
+                <w:rFonts w:ascii="Times New Roman" w:hAnsi="Times New Roman" w:cs="Times New Roman"/>
+                <w:lang w:val="en-CA"/>
+              </w:rPr>
+            </w:pPr>
+            <w:proofErr w:type="spellStart"/>
+            <w:r>
+              <w:rPr>
+                <w:rFonts w:ascii="Times New Roman" w:hAnsi="Times New Roman" w:cs="Times New Roman"/>
+              </w:rPr>
+              <w:t>XBee</w:t>
+            </w:r>
+            <w:proofErr w:type="spellEnd"/>
+            <w:r>
+              <w:rPr>
+                <w:rFonts w:ascii="Times New Roman" w:hAnsi="Times New Roman" w:cs="Times New Roman"/>
+              </w:rPr>
+              <w:t xml:space="preserve"> XB24CAPIT-001</w:t>
+            </w:r>
+          </w:p>
+        </w:tc>
+        <w:tc>
+          <w:tcPr>
+            <w:tcW w:w="0" w:type="auto"/>
+            <w:vAlign w:val="center"/>
+            <w:hideMark/>
+          </w:tcPr>
+          <w:p>
+            <w:pPr>
+              <w:jc w:val="center"/>
+              <w:rPr>
+                <w:rFonts w:ascii="Times New Roman" w:hAnsi="Times New Roman" w:cs="Times New Roman"/>
+                <w:lang w:val="en-CA"/>
+              </w:rPr>
+            </w:pPr>
+            <w:r>
+              <w:rPr>
+                <w:rFonts w:ascii="Times New Roman" w:hAnsi="Times New Roman" w:cs="Times New Roman"/>
+                <w:lang w:val="en-CA"/>
+              </w:rPr>
+              <w:t>1</w:t>
+            </w:r>
+          </w:p>
+        </w:tc>
+        <w:tc>
+          <w:tcPr>
+            <w:tcW w:w="1491" w:type="dxa"/>
+            <w:vAlign w:val="center"/>
+          </w:tcPr>
+          <w:p>
+            <w:pPr>
+              <w:jc w:val="center"/>
+              <w:rPr>
+                <w:rFonts w:ascii="Times New Roman" w:hAnsi="Times New Roman" w:cs="Times New Roman"/>
+                <w:lang w:val="en-CA"/>
+              </w:rPr>
+            </w:pPr>
+            <w:r>
+              <w:rPr>
+                <w:rFonts w:ascii="Times New Roman" w:hAnsi="Times New Roman" w:cs="Times New Roman"/>
+                <w:lang w:val="en-CA"/>
+              </w:rPr>
+              <w:t>33</w:t>
+            </w:r>
+            <w:r>
+              <w:rPr>
+                <w:rFonts w:ascii="Times New Roman" w:hAnsi="Times New Roman" w:cs="Times New Roman"/>
+                <w:lang w:val="en-CA"/>
+              </w:rPr>
+              <w:t xml:space="preserve"> </w:t>
+            </w:r>
+            <w:r>
+              <w:rPr>
+                <w:rFonts w:ascii="Times New Roman" w:hAnsi="Times New Roman" w:cs="Times New Roman"/>
+                <w:lang w:val="en-CA"/>
+              </w:rPr>
+              <w:t>mA</w:t>
+            </w:r>
+          </w:p>
+        </w:tc>
+        <w:tc>
+          <w:tcPr>
+            <w:tcW w:w="1530" w:type="dxa"/>
+          </w:tcPr>
+          <w:p>
+            <w:pPr>
+              <w:jc w:val="center"/>
+              <w:rPr>
+                <w:rFonts w:ascii="Times New Roman" w:hAnsi="Times New Roman" w:cs="Times New Roman"/>
+                <w:lang w:val="en-CA"/>
+              </w:rPr>
+            </w:pPr>
+            <w:r>
+              <w:rPr>
+                <w:rFonts w:ascii="Times New Roman" w:hAnsi="Times New Roman" w:cs="Times New Roman"/>
+                <w:lang w:val="en-CA"/>
+              </w:rPr>
+              <w:t>33</w:t>
+            </w:r>
+            <w:r>
+              <w:rPr>
+                <w:rFonts w:ascii="Times New Roman" w:hAnsi="Times New Roman" w:cs="Times New Roman"/>
+                <w:lang w:val="en-CA"/>
+              </w:rPr>
+              <w:t xml:space="preserve"> </w:t>
+            </w:r>
+            <w:r>
+              <w:rPr>
+                <w:rFonts w:ascii="Times New Roman" w:hAnsi="Times New Roman" w:cs="Times New Roman"/>
+                <w:lang w:val="en-CA"/>
+              </w:rPr>
+              <w:t>mA</w:t>
+            </w:r>
+          </w:p>
+        </w:tc>
+        <w:tc>
+          <w:tcPr>
+            <w:tcW w:w="1939" w:type="dxa"/>
+          </w:tcPr>
+          <w:p>
+            <w:pPr>
+              <w:rPr>
+                <w:rFonts w:ascii="Times New Roman" w:hAnsi="Times New Roman" w:cs="Times New Roman"/>
+                <w:lang w:val="en-CA"/>
+              </w:rPr>
+            </w:pPr>
+          </w:p>
+        </w:tc>
+      </w:tr>
+      <w:tr>
+        <w:trPr>
+          <w:trHeight w:val="462"/>
+          <w:tblCellSpacing w:w="15" w:type="dxa"/>
+        </w:trPr>
+        <w:tc>
+          <w:tcPr>
+            <w:tcW w:w="0" w:type="auto"/>
+            <w:vAlign w:val="center"/>
+            <w:hideMark/>
+          </w:tcPr>
+          <w:p>
+            <w:pPr>
+              <w:rPr>
+                <w:rFonts w:ascii="Times New Roman" w:hAnsi="Times New Roman" w:cs="Times New Roman"/>
+                <w:lang w:val="en-CA"/>
+              </w:rPr>
+            </w:pPr>
+            <w:proofErr w:type="gramStart"/>
+            <w:r>
+              <w:rPr>
+                <w:rFonts w:ascii="Times New Roman" w:hAnsi="Times New Roman" w:cs="Times New Roman"/>
+              </w:rPr>
+              <w:t>u</w:t>
+            </w:r>
+            <w:proofErr w:type="gramEnd"/>
+            <w:r>
+              <w:rPr>
+                <w:rFonts w:ascii="Times New Roman" w:hAnsi="Times New Roman" w:cs="Times New Roman"/>
+              </w:rPr>
+              <w:t>-</w:t>
+            </w:r>
+            <w:proofErr w:type="spellStart"/>
+            <w:r>
+              <w:rPr>
+                <w:rFonts w:ascii="Times New Roman" w:hAnsi="Times New Roman" w:cs="Times New Roman"/>
+              </w:rPr>
+              <w:t>blox</w:t>
+            </w:r>
+            <w:proofErr w:type="spellEnd"/>
+            <w:r>
+              <w:rPr>
+                <w:rFonts w:ascii="Times New Roman" w:hAnsi="Times New Roman" w:cs="Times New Roman"/>
+              </w:rPr>
+              <w:t xml:space="preserve"> ZOE-M8Q</w:t>
+            </w:r>
+          </w:p>
+        </w:tc>
+        <w:tc>
+          <w:tcPr>
+            <w:tcW w:w="0" w:type="auto"/>
+            <w:vAlign w:val="center"/>
+            <w:hideMark/>
+          </w:tcPr>
+          <w:p>
+            <w:pPr>
+              <w:jc w:val="center"/>
+              <w:rPr>
+                <w:rFonts w:ascii="Times New Roman" w:hAnsi="Times New Roman" w:cs="Times New Roman"/>
+                <w:lang w:val="en-CA"/>
+              </w:rPr>
+            </w:pPr>
+            <w:r>
+              <w:rPr>
+                <w:rFonts w:ascii="Times New Roman" w:hAnsi="Times New Roman" w:cs="Times New Roman"/>
+                <w:lang w:val="en-CA"/>
+              </w:rPr>
+              <w:t>1</w:t>
+            </w:r>
+          </w:p>
+        </w:tc>
+        <w:tc>
+          <w:tcPr>
+            <w:tcW w:w="1491" w:type="dxa"/>
+            <w:vAlign w:val="center"/>
+            <w:hideMark/>
+          </w:tcPr>
+          <w:p>
+            <w:pPr>
+              <w:jc w:val="center"/>
+              <w:rPr>
+                <w:rFonts w:ascii="Times New Roman" w:hAnsi="Times New Roman" w:cs="Times New Roman"/>
+                <w:lang w:val="en-CA"/>
+              </w:rPr>
+            </w:pPr>
+            <w:r>
+              <w:rPr>
+                <w:rFonts w:ascii="Times New Roman" w:hAnsi="Times New Roman" w:cs="Times New Roman"/>
+                <w:lang w:val="en-CA"/>
+              </w:rPr>
+              <w:t>67</w:t>
+            </w:r>
+            <w:r>
+              <w:rPr>
+                <w:rFonts w:ascii="Times New Roman" w:hAnsi="Times New Roman" w:cs="Times New Roman"/>
+                <w:lang w:val="en-CA"/>
+              </w:rPr>
+              <w:t xml:space="preserve"> </w:t>
+            </w:r>
+            <w:r>
+              <w:rPr>
+                <w:rFonts w:ascii="Times New Roman" w:hAnsi="Times New Roman" w:cs="Times New Roman"/>
+                <w:lang w:val="en-CA"/>
+              </w:rPr>
+              <w:t>mA</w:t>
+            </w:r>
+          </w:p>
+        </w:tc>
+        <w:tc>
+          <w:tcPr>
+            <w:tcW w:w="1530" w:type="dxa"/>
+          </w:tcPr>
+          <w:p>
+            <w:pPr>
+              <w:jc w:val="center"/>
+              <w:rPr>
+                <w:rFonts w:ascii="Times New Roman" w:hAnsi="Times New Roman" w:cs="Times New Roman"/>
+                <w:lang w:val="en-CA"/>
+              </w:rPr>
+            </w:pPr>
+            <w:r>
+              <w:rPr>
+                <w:rFonts w:ascii="Times New Roman" w:hAnsi="Times New Roman" w:cs="Times New Roman"/>
+                <w:lang w:val="en-CA"/>
+              </w:rPr>
+              <w:t>67</w:t>
+            </w:r>
+            <w:r>
+              <w:rPr>
+                <w:rFonts w:ascii="Times New Roman" w:hAnsi="Times New Roman" w:cs="Times New Roman"/>
+                <w:lang w:val="en-CA"/>
+              </w:rPr>
+              <w:t xml:space="preserve"> </w:t>
+            </w:r>
+            <w:r>
+              <w:rPr>
+                <w:rFonts w:ascii="Times New Roman" w:hAnsi="Times New Roman" w:cs="Times New Roman"/>
+                <w:lang w:val="en-CA"/>
+              </w:rPr>
+              <w:t>mA</w:t>
+            </w:r>
+          </w:p>
+        </w:tc>
+        <w:tc>
+          <w:tcPr>
+            <w:tcW w:w="1939" w:type="dxa"/>
+          </w:tcPr>
+          <w:p>
+            <w:pPr>
+              <w:rPr>
+                <w:rFonts w:ascii="Times New Roman" w:hAnsi="Times New Roman" w:cs="Times New Roman"/>
+                <w:lang w:val="en-CA"/>
+              </w:rPr>
+            </w:pPr>
+          </w:p>
+        </w:tc>
+      </w:tr>
+      <w:tr>
+        <w:trPr>
+          <w:trHeight w:val="462"/>
+          <w:tblCellSpacing w:w="15" w:type="dxa"/>
+        </w:trPr>
+        <w:tc>
+          <w:tcPr>
+            <w:tcW w:w="0" w:type="auto"/>
+            <w:vAlign w:val="center"/>
+          </w:tcPr>
+          <w:p>
+            <w:pPr>
+              <w:rPr>
+                <w:rFonts w:ascii="Times New Roman" w:hAnsi="Times New Roman" w:cs="Times New Roman"/>
+                <w:lang w:val="en-CA"/>
+              </w:rPr>
+            </w:pPr>
+            <w:r>
+              <w:rPr>
+                <w:rFonts w:ascii="Times New Roman" w:hAnsi="Times New Roman" w:cs="Times New Roman"/>
+              </w:rPr>
+              <w:t>BNO085</w:t>
+            </w:r>
+          </w:p>
+        </w:tc>
+        <w:tc>
+          <w:tcPr>
+            <w:tcW w:w="0" w:type="auto"/>
+            <w:vAlign w:val="center"/>
+          </w:tcPr>
+          <w:p>
+            <w:pPr>
+              <w:jc w:val="center"/>
+              <w:rPr>
+                <w:rFonts w:ascii="Times New Roman" w:hAnsi="Times New Roman" w:cs="Times New Roman"/>
+                <w:lang w:val="en-CA"/>
+              </w:rPr>
+            </w:pPr>
+            <w:r>
+              <w:rPr>
+                <w:rFonts w:ascii="Times New Roman" w:hAnsi="Times New Roman" w:cs="Times New Roman"/>
+                <w:lang w:val="en-CA"/>
+              </w:rPr>
+              <w:t>1</w:t>
+            </w:r>
+          </w:p>
+        </w:tc>
+        <w:tc>
+          <w:tcPr>
+            <w:tcW w:w="1491" w:type="dxa"/>
+            <w:vAlign w:val="center"/>
+          </w:tcPr>
+          <w:p>
+            <w:pPr>
+              <w:jc w:val="center"/>
+              <w:rPr>
+                <w:rFonts w:ascii="Times New Roman" w:hAnsi="Times New Roman" w:cs="Times New Roman"/>
+                <w:lang w:val="en-CA"/>
+              </w:rPr>
+            </w:pPr>
+            <w:r>
+              <w:rPr>
+                <w:rFonts w:ascii="Times New Roman" w:hAnsi="Times New Roman" w:cs="Times New Roman"/>
+                <w:lang w:val="en-CA"/>
+              </w:rPr>
+              <w:t>30</w:t>
+            </w:r>
+            <w:r>
+              <w:rPr>
+                <w:rFonts w:ascii="Times New Roman" w:hAnsi="Times New Roman" w:cs="Times New Roman"/>
+                <w:lang w:val="en-CA"/>
+              </w:rPr>
+              <w:t xml:space="preserve"> </w:t>
+            </w:r>
+            <w:r>
+              <w:rPr>
+                <w:rFonts w:ascii="Times New Roman" w:hAnsi="Times New Roman" w:cs="Times New Roman"/>
+                <w:lang w:val="en-CA"/>
+              </w:rPr>
+              <w:t>mA</w:t>
+            </w:r>
+          </w:p>
+        </w:tc>
+        <w:tc>
+          <w:tcPr>
+            <w:tcW w:w="1530" w:type="dxa"/>
+          </w:tcPr>
+          <w:p>
+            <w:pPr>
+              <w:jc w:val="center"/>
+              <w:rPr>
+                <w:rFonts w:ascii="Times New Roman" w:hAnsi="Times New Roman" w:cs="Times New Roman"/>
+                <w:lang w:val="en-CA"/>
+              </w:rPr>
+            </w:pPr>
+            <w:r>
+              <w:rPr>
+                <w:rFonts w:ascii="Times New Roman" w:hAnsi="Times New Roman" w:cs="Times New Roman"/>
+                <w:lang w:val="en-CA"/>
+              </w:rPr>
+              <w:t>30</w:t>
+            </w:r>
+            <w:r>
+              <w:rPr>
+                <w:rFonts w:ascii="Times New Roman" w:hAnsi="Times New Roman" w:cs="Times New Roman"/>
+                <w:lang w:val="en-CA"/>
+              </w:rPr>
+              <w:t xml:space="preserve"> </w:t>
+            </w:r>
+            <w:r>
+              <w:rPr>
+                <w:rFonts w:ascii="Times New Roman" w:hAnsi="Times New Roman" w:cs="Times New Roman"/>
+                <w:lang w:val="en-CA"/>
+              </w:rPr>
+              <w:t>mA</w:t>
+            </w:r>
+          </w:p>
+        </w:tc>
+        <w:tc>
+          <w:tcPr>
+            <w:tcW w:w="1939" w:type="dxa"/>
+          </w:tcPr>
+          <w:p>
+            <w:pPr>
+              <w:rPr>
+                <w:rFonts w:ascii="Times New Roman" w:hAnsi="Times New Roman" w:cs="Times New Roman"/>
+                <w:lang w:val="en-CA"/>
+              </w:rPr>
+            </w:pPr>
+          </w:p>
+        </w:tc>
+      </w:tr>
+      <w:tr>
+        <w:trPr>
+          <w:trHeight w:val="462"/>
+          <w:tblCellSpacing w:w="15" w:type="dxa"/>
+        </w:trPr>
+        <w:tc>
+          <w:tcPr>
+            <w:tcW w:w="0" w:type="auto"/>
+            <w:vAlign w:val="center"/>
+          </w:tcPr>
+          <w:p>
+            <w:pPr>
+              <w:rPr>
+                <w:rFonts w:ascii="Times New Roman" w:hAnsi="Times New Roman" w:cs="Times New Roman"/>
+                <w:lang w:val="en-CA"/>
+              </w:rPr>
+            </w:pPr>
+            <w:r>
+              <w:rPr>
+                <w:rFonts w:ascii="Times New Roman" w:hAnsi="Times New Roman" w:cs="Times New Roman"/>
+              </w:rPr>
+              <w:t>BMP390</w:t>
+            </w:r>
+          </w:p>
+        </w:tc>
+        <w:tc>
+          <w:tcPr>
+            <w:tcW w:w="0" w:type="auto"/>
+            <w:vAlign w:val="center"/>
+          </w:tcPr>
+          <w:p>
+            <w:pPr>
+              <w:jc w:val="center"/>
+              <w:rPr>
+                <w:rFonts w:ascii="Times New Roman" w:hAnsi="Times New Roman" w:cs="Times New Roman"/>
+                <w:lang w:val="en-CA"/>
+              </w:rPr>
+            </w:pPr>
+            <w:r>
+              <w:rPr>
+                <w:rFonts w:ascii="Times New Roman" w:hAnsi="Times New Roman" w:cs="Times New Roman"/>
+                <w:lang w:val="en-CA"/>
+              </w:rPr>
+              <w:t>1</w:t>
+            </w:r>
+          </w:p>
+        </w:tc>
+        <w:tc>
+          <w:tcPr>
+            <w:tcW w:w="1491" w:type="dxa"/>
+            <w:vAlign w:val="center"/>
+          </w:tcPr>
+          <w:p>
+            <w:pPr>
+              <w:jc w:val="center"/>
+              <w:rPr>
+                <w:rFonts w:ascii="Times New Roman" w:hAnsi="Times New Roman" w:cs="Times New Roman"/>
+                <w:lang w:val="en-CA"/>
+              </w:rPr>
+            </w:pPr>
+            <w:r>
+              <w:rPr>
+                <w:rFonts w:ascii="Times New Roman" w:hAnsi="Times New Roman" w:cs="Times New Roman"/>
+                <w:lang w:val="en-CA"/>
+              </w:rPr>
+              <w:t>0.73</w:t>
+            </w:r>
+            <w:r>
+              <w:rPr>
+                <w:rFonts w:ascii="Times New Roman" w:hAnsi="Times New Roman" w:cs="Times New Roman"/>
+                <w:lang w:val="en-CA"/>
+              </w:rPr>
+              <w:t xml:space="preserve"> </w:t>
+            </w:r>
+            <w:r>
+              <w:rPr>
+                <w:rFonts w:ascii="Times New Roman" w:hAnsi="Times New Roman" w:cs="Times New Roman"/>
+                <w:lang w:val="en-CA"/>
+              </w:rPr>
+              <w:t>mA</w:t>
+            </w:r>
+          </w:p>
+        </w:tc>
+        <w:tc>
+          <w:tcPr>
+            <w:tcW w:w="1530" w:type="dxa"/>
+          </w:tcPr>
+          <w:p>
+            <w:pPr>
+              <w:jc w:val="center"/>
+              <w:rPr>
+                <w:rFonts w:ascii="Times New Roman" w:hAnsi="Times New Roman" w:cs="Times New Roman"/>
+                <w:lang w:val="en-CA"/>
+              </w:rPr>
+            </w:pPr>
+            <w:r>
+              <w:rPr>
+                <w:rFonts w:ascii="Times New Roman" w:hAnsi="Times New Roman" w:cs="Times New Roman"/>
+                <w:lang w:val="en-CA"/>
+              </w:rPr>
+              <w:t>0.73</w:t>
+            </w:r>
+            <w:r>
+              <w:rPr>
+                <w:rFonts w:ascii="Times New Roman" w:hAnsi="Times New Roman" w:cs="Times New Roman"/>
+                <w:lang w:val="en-CA"/>
+              </w:rPr>
+              <w:t xml:space="preserve"> </w:t>
+            </w:r>
+            <w:r>
+              <w:rPr>
+                <w:rFonts w:ascii="Times New Roman" w:hAnsi="Times New Roman" w:cs="Times New Roman"/>
+                <w:lang w:val="en-CA"/>
+              </w:rPr>
+              <w:t>mA</w:t>
+            </w:r>
+          </w:p>
+        </w:tc>
+        <w:tc>
+          <w:tcPr>
+            <w:tcW w:w="1939" w:type="dxa"/>
+          </w:tcPr>
+          <w:p>
+            <w:pPr>
+              <w:rPr>
+                <w:rFonts w:ascii="Times New Roman" w:hAnsi="Times New Roman" w:cs="Times New Roman"/>
+                <w:lang w:val="en-CA"/>
+              </w:rPr>
+            </w:pPr>
+          </w:p>
+        </w:tc>
+      </w:tr>
+      <w:tr>
+        <w:trPr>
+          <w:trHeight w:val="462"/>
+          <w:tblCellSpacing w:w="15" w:type="dxa"/>
+        </w:trPr>
+        <w:tc>
+          <w:tcPr>
+            <w:tcW w:w="0" w:type="auto"/>
+            <w:vAlign w:val="center"/>
+          </w:tcPr>
+          <w:p>
+            <w:pPr>
+              <w:rPr>
+                <w:rFonts w:ascii="Times New Roman" w:hAnsi="Times New Roman" w:cs="Times New Roman"/>
+              </w:rPr>
+            </w:pPr>
+            <w:r>
+              <w:rPr>
+                <w:rFonts w:ascii="Times New Roman" w:hAnsi="Times New Roman" w:cs="Times New Roman"/>
+              </w:rPr>
+              <w:t>INA260</w:t>
+            </w:r>
+          </w:p>
+        </w:tc>
+        <w:tc>
+          <w:tcPr>
+            <w:tcW w:w="0" w:type="auto"/>
+            <w:vAlign w:val="center"/>
+          </w:tcPr>
+          <w:p>
+            <w:pPr>
+              <w:jc w:val="center"/>
+              <w:rPr>
+                <w:rFonts w:ascii="Times New Roman" w:hAnsi="Times New Roman" w:cs="Times New Roman"/>
+                <w:lang w:val="en-CA"/>
+              </w:rPr>
+            </w:pPr>
+            <w:r>
+              <w:rPr>
+                <w:rFonts w:ascii="Times New Roman" w:hAnsi="Times New Roman" w:cs="Times New Roman"/>
+                <w:lang w:val="en-CA"/>
+              </w:rPr>
+              <w:t>1</w:t>
+            </w:r>
+          </w:p>
+        </w:tc>
+        <w:tc>
+          <w:tcPr>
+            <w:tcW w:w="1491" w:type="dxa"/>
+            <w:vAlign w:val="center"/>
+          </w:tcPr>
+          <w:p>
+            <w:pPr>
+              <w:jc w:val="center"/>
+              <w:rPr>
+                <w:rFonts w:ascii="Times New Roman" w:hAnsi="Times New Roman" w:cs="Times New Roman"/>
+                <w:lang w:val="en-CA"/>
+              </w:rPr>
+            </w:pPr>
+            <w:r>
+              <w:rPr>
+                <w:rFonts w:ascii="Times New Roman" w:hAnsi="Times New Roman" w:cs="Times New Roman"/>
+              </w:rPr>
+              <w:t>0.42 mA</w:t>
+            </w:r>
+          </w:p>
+        </w:tc>
+        <w:tc>
+          <w:tcPr>
+            <w:tcW w:w="1530" w:type="dxa"/>
+          </w:tcPr>
+          <w:p>
+            <w:pPr>
+              <w:jc w:val="center"/>
+              <w:rPr>
+                <w:rFonts w:ascii="Times New Roman" w:hAnsi="Times New Roman" w:cs="Times New Roman"/>
+                <w:lang w:val="en-CA"/>
+              </w:rPr>
+            </w:pPr>
+            <w:r>
+              <w:rPr>
+                <w:rFonts w:ascii="Times New Roman" w:hAnsi="Times New Roman" w:cs="Times New Roman"/>
+              </w:rPr>
+              <w:t>0.42 mA</w:t>
+            </w:r>
+          </w:p>
+        </w:tc>
+        <w:tc>
+          <w:tcPr>
+            <w:tcW w:w="1939" w:type="dxa"/>
+          </w:tcPr>
+          <w:p>
+            <w:pPr>
+              <w:rPr>
+                <w:rFonts w:ascii="Times New Roman" w:hAnsi="Times New Roman" w:cs="Times New Roman"/>
+                <w:lang w:val="en-CA"/>
+              </w:rPr>
+            </w:pPr>
+          </w:p>
+        </w:tc>
+      </w:tr>
+      <w:tr>
+        <w:trPr>
+          <w:trHeight w:val="462"/>
+          <w:tblCellSpacing w:w="15" w:type="dxa"/>
+        </w:trPr>
+        <w:tc>
+          <w:tcPr>
+            <w:tcW w:w="0" w:type="auto"/>
+            <w:vAlign w:val="center"/>
+          </w:tcPr>
+          <w:p>
+            <w:pPr>
+              <w:rPr>
+                <w:rFonts w:ascii="Times New Roman" w:hAnsi="Times New Roman" w:cs="Times New Roman"/>
+              </w:rPr>
+            </w:pPr>
+            <w:r>
+              <w:rPr>
+                <w:rFonts w:ascii="Times New Roman" w:hAnsi="Times New Roman" w:cs="Times New Roman"/>
+              </w:rPr>
+              <w:t>ADXL375</w:t>
+            </w:r>
+          </w:p>
+        </w:tc>
+        <w:tc>
+          <w:tcPr>
+            <w:tcW w:w="0" w:type="auto"/>
+            <w:vAlign w:val="center"/>
+          </w:tcPr>
+          <w:p>
+            <w:pPr>
+              <w:jc w:val="center"/>
+              <w:rPr>
+                <w:rFonts w:ascii="Times New Roman" w:hAnsi="Times New Roman" w:cs="Times New Roman"/>
+                <w:lang w:val="en-CA"/>
+              </w:rPr>
+            </w:pPr>
+            <w:r>
+              <w:rPr>
+                <w:rFonts w:ascii="Times New Roman" w:hAnsi="Times New Roman" w:cs="Times New Roman"/>
+                <w:lang w:val="en-CA"/>
+              </w:rPr>
+              <w:t>1</w:t>
+            </w:r>
+          </w:p>
+        </w:tc>
+        <w:tc>
+          <w:tcPr>
+            <w:tcW w:w="1491" w:type="dxa"/>
+            <w:vAlign w:val="center"/>
+          </w:tcPr>
+          <w:p>
+            <w:pPr>
+              <w:jc w:val="center"/>
+              <w:rPr>
+                <w:rFonts w:ascii="Times New Roman" w:hAnsi="Times New Roman" w:cs="Times New Roman"/>
+                <w:lang w:val="en-CA"/>
+              </w:rPr>
+            </w:pPr>
+            <w:r>
+              <w:rPr>
+                <w:rFonts w:ascii="Times New Roman" w:hAnsi="Times New Roman" w:cs="Times New Roman"/>
+              </w:rPr>
+              <w:t>0.145 mA</w:t>
+            </w:r>
+          </w:p>
+        </w:tc>
+        <w:tc>
+          <w:tcPr>
+            <w:tcW w:w="1530" w:type="dxa"/>
+          </w:tcPr>
+          <w:p>
+            <w:pPr>
+              <w:jc w:val="center"/>
+              <w:rPr>
+                <w:rFonts w:ascii="Times New Roman" w:hAnsi="Times New Roman" w:cs="Times New Roman"/>
+                <w:lang w:val="en-CA"/>
+              </w:rPr>
+            </w:pPr>
+            <w:r>
+              <w:rPr>
+                <w:rFonts w:ascii="Times New Roman" w:hAnsi="Times New Roman" w:cs="Times New Roman"/>
+              </w:rPr>
+              <w:t>0.145 mA</w:t>
+            </w:r>
+          </w:p>
+        </w:tc>
+        <w:tc>
+          <w:tcPr>
+            <w:tcW w:w="1939" w:type="dxa"/>
+          </w:tcPr>
+          <w:p>
+            <w:pPr>
+              <w:rPr>
+                <w:rFonts w:ascii="Times New Roman" w:hAnsi="Times New Roman" w:cs="Times New Roman"/>
+                <w:lang w:val="en-CA"/>
+              </w:rPr>
+            </w:pPr>
+          </w:p>
+        </w:tc>
+      </w:tr>
+      <w:tr>
+        <w:trPr>
+          <w:trHeight w:val="462"/>
+          <w:tblCellSpacing w:w="15" w:type="dxa"/>
+        </w:trPr>
+        <w:tc>
+          <w:tcPr>
+            <w:tcW w:w="0" w:type="auto"/>
+            <w:vAlign w:val="center"/>
+          </w:tcPr>
+          <w:p>
+            <w:pPr>
+              <w:rPr>
+                <w:rFonts w:ascii="Times New Roman" w:hAnsi="Times New Roman" w:cs="Times New Roman"/>
+              </w:rPr>
+            </w:pPr>
+            <w:proofErr w:type="spellStart"/>
+            <w:proofErr w:type="gramStart"/>
+            <w:r>
+              <w:rPr>
+                <w:rFonts w:ascii="Times New Roman" w:hAnsi="Times New Roman" w:cs="Times New Roman"/>
+              </w:rPr>
+              <w:t>microSD</w:t>
+            </w:r>
+            <w:proofErr w:type="spellEnd"/>
+            <w:proofErr w:type="gramEnd"/>
+            <w:r>
+              <w:rPr>
+                <w:rFonts w:ascii="Times New Roman" w:hAnsi="Times New Roman" w:cs="Times New Roman"/>
+              </w:rPr>
+              <w:t xml:space="preserve"> </w:t>
+            </w:r>
+            <w:proofErr w:type="spellStart"/>
+            <w:r>
+              <w:rPr>
+                <w:rFonts w:ascii="Times New Roman" w:hAnsi="Times New Roman" w:cs="Times New Roman"/>
+              </w:rPr>
+              <w:t>card</w:t>
+            </w:r>
+            <w:proofErr w:type="spellEnd"/>
+          </w:p>
+        </w:tc>
+        <w:tc>
+          <w:tcPr>
+            <w:tcW w:w="0" w:type="auto"/>
+            <w:vAlign w:val="center"/>
+          </w:tcPr>
+          <w:p>
+            <w:pPr>
+              <w:jc w:val="center"/>
+              <w:rPr>
+                <w:rFonts w:ascii="Times New Roman" w:hAnsi="Times New Roman" w:cs="Times New Roman"/>
+                <w:lang w:val="en-CA"/>
+              </w:rPr>
+            </w:pPr>
+            <w:r>
+              <w:rPr>
+                <w:rFonts w:ascii="Times New Roman" w:hAnsi="Times New Roman" w:cs="Times New Roman"/>
+                <w:lang w:val="en-CA"/>
+              </w:rPr>
+              <w:t>1</w:t>
+            </w:r>
+          </w:p>
+        </w:tc>
+        <w:tc>
+          <w:tcPr>
+            <w:tcW w:w="1491" w:type="dxa"/>
+            <w:vAlign w:val="center"/>
+          </w:tcPr>
+          <w:p>
+            <w:pPr>
+              <w:jc w:val="center"/>
+              <w:rPr>
+                <w:rFonts w:ascii="Times New Roman" w:hAnsi="Times New Roman" w:cs="Times New Roman"/>
+                <w:lang w:val="en-CA"/>
+              </w:rPr>
+            </w:pPr>
+            <w:r>
+              <w:rPr>
+                <w:rFonts w:ascii="Times New Roman" w:hAnsi="Times New Roman" w:cs="Times New Roman"/>
+                <w:lang w:val="en-CA"/>
+              </w:rPr>
+              <w:t>100</w:t>
+            </w:r>
+            <w:r>
+              <w:rPr>
+                <w:rFonts w:ascii="Times New Roman" w:hAnsi="Times New Roman" w:cs="Times New Roman"/>
+                <w:lang w:val="en-CA"/>
+              </w:rPr>
+              <w:t xml:space="preserve"> </w:t>
+            </w:r>
+            <w:r>
+              <w:rPr>
+                <w:rFonts w:ascii="Times New Roman" w:hAnsi="Times New Roman" w:cs="Times New Roman"/>
+                <w:lang w:val="en-CA"/>
+              </w:rPr>
+              <w:t>mA</w:t>
+            </w:r>
+          </w:p>
+        </w:tc>
+        <w:tc>
+          <w:tcPr>
+            <w:tcW w:w="1530" w:type="dxa"/>
+          </w:tcPr>
+          <w:p>
+            <w:pPr>
+              <w:jc w:val="center"/>
+              <w:rPr>
+                <w:rFonts w:ascii="Times New Roman" w:hAnsi="Times New Roman" w:cs="Times New Roman"/>
+                <w:lang w:val="en-CA"/>
+              </w:rPr>
+            </w:pPr>
+            <w:r>
+              <w:rPr>
+                <w:rFonts w:ascii="Times New Roman" w:hAnsi="Times New Roman" w:cs="Times New Roman"/>
+                <w:lang w:val="en-CA"/>
+              </w:rPr>
+              <w:t>100</w:t>
+            </w:r>
+            <w:r>
+              <w:rPr>
+                <w:rFonts w:ascii="Times New Roman" w:hAnsi="Times New Roman" w:cs="Times New Roman"/>
+                <w:lang w:val="en-CA"/>
+              </w:rPr>
+              <w:t xml:space="preserve"> </w:t>
+            </w:r>
+            <w:r>
+              <w:rPr>
+                <w:rFonts w:ascii="Times New Roman" w:hAnsi="Times New Roman" w:cs="Times New Roman"/>
+                <w:lang w:val="en-CA"/>
+              </w:rPr>
+              <w:t>mA</w:t>
+            </w:r>
+          </w:p>
+        </w:tc>
+        <w:tc>
+          <w:tcPr>
+            <w:tcW w:w="1939" w:type="dxa"/>
+          </w:tcPr>
+          <w:p>
+            <w:pPr>
+              <w:rPr>
+                <w:rFonts w:ascii="Times New Roman" w:hAnsi="Times New Roman" w:cs="Times New Roman"/>
+                <w:lang w:val="en-CA"/>
+              </w:rPr>
+            </w:pPr>
+          </w:p>
+        </w:tc>
+      </w:tr>
+      <w:tr>
+        <w:trPr>
+          <w:trHeight w:val="462"/>
+          <w:tblCellSpacing w:w="15" w:type="dxa"/>
+        </w:trPr>
+        <w:tc>
+          <w:tcPr>
+            <w:tcW w:w="0" w:type="auto"/>
+            <w:vAlign w:val="center"/>
+          </w:tcPr>
+          <w:p>
+            <w:pPr>
+              <w:rPr>
+                <w:rFonts w:ascii="Times New Roman" w:hAnsi="Times New Roman" w:cs="Times New Roman"/>
+              </w:rPr>
+            </w:pPr>
+            <w:r>
+              <w:rPr>
+                <w:rFonts w:ascii="Times New Roman" w:hAnsi="Times New Roman" w:cs="Times New Roman"/>
+              </w:rPr>
+              <w:t>QSPI flash</w:t>
+            </w:r>
+          </w:p>
+        </w:tc>
+        <w:tc>
+          <w:tcPr>
+            <w:tcW w:w="0" w:type="auto"/>
+            <w:vAlign w:val="center"/>
+          </w:tcPr>
+          <w:p>
+            <w:pPr>
+              <w:jc w:val="center"/>
+              <w:rPr>
+                <w:rFonts w:ascii="Times New Roman" w:hAnsi="Times New Roman" w:cs="Times New Roman"/>
+                <w:lang w:val="en-CA"/>
+              </w:rPr>
+            </w:pPr>
+            <w:r>
+              <w:rPr>
+                <w:rFonts w:ascii="Times New Roman" w:hAnsi="Times New Roman" w:cs="Times New Roman"/>
+                <w:lang w:val="en-CA"/>
+              </w:rPr>
+              <w:t>1</w:t>
+            </w:r>
+          </w:p>
+        </w:tc>
+        <w:tc>
+          <w:tcPr>
+            <w:tcW w:w="1491" w:type="dxa"/>
+            <w:vAlign w:val="center"/>
+          </w:tcPr>
+          <w:p>
+            <w:pPr>
+              <w:jc w:val="center"/>
+              <w:rPr>
+                <w:rFonts w:ascii="Times New Roman" w:hAnsi="Times New Roman" w:cs="Times New Roman"/>
+                <w:lang w:val="en-CA"/>
+              </w:rPr>
+            </w:pPr>
+            <w:r>
+              <w:rPr>
+                <w:rFonts w:ascii="Times New Roman" w:hAnsi="Times New Roman" w:cs="Times New Roman"/>
+                <w:lang w:val="en-CA"/>
+              </w:rPr>
+              <w:t>20</w:t>
+            </w:r>
+            <w:r>
+              <w:rPr>
+                <w:rFonts w:ascii="Times New Roman" w:hAnsi="Times New Roman" w:cs="Times New Roman"/>
+                <w:lang w:val="en-CA"/>
+              </w:rPr>
+              <w:t xml:space="preserve"> </w:t>
+            </w:r>
+            <w:r>
+              <w:rPr>
+                <w:rFonts w:ascii="Times New Roman" w:hAnsi="Times New Roman" w:cs="Times New Roman"/>
+                <w:lang w:val="en-CA"/>
+              </w:rPr>
+              <w:t>mA</w:t>
+            </w:r>
+          </w:p>
+        </w:tc>
+        <w:tc>
+          <w:tcPr>
+            <w:tcW w:w="1530" w:type="dxa"/>
+          </w:tcPr>
+          <w:p>
+            <w:pPr>
+              <w:jc w:val="center"/>
+              <w:rPr>
+                <w:rFonts w:ascii="Times New Roman" w:hAnsi="Times New Roman" w:cs="Times New Roman"/>
+                <w:lang w:val="en-CA"/>
+              </w:rPr>
+            </w:pPr>
+            <w:r>
+              <w:rPr>
+                <w:rFonts w:ascii="Times New Roman" w:hAnsi="Times New Roman" w:cs="Times New Roman"/>
+                <w:lang w:val="en-CA"/>
+              </w:rPr>
+              <w:t>20</w:t>
+            </w:r>
+            <w:r>
+              <w:rPr>
+                <w:rFonts w:ascii="Times New Roman" w:hAnsi="Times New Roman" w:cs="Times New Roman"/>
+                <w:lang w:val="en-CA"/>
+              </w:rPr>
+              <w:t xml:space="preserve"> </w:t>
+            </w:r>
+            <w:r>
+              <w:rPr>
+                <w:rFonts w:ascii="Times New Roman" w:hAnsi="Times New Roman" w:cs="Times New Roman"/>
+                <w:lang w:val="en-CA"/>
+              </w:rPr>
+              <w:t>mA</w:t>
+            </w:r>
+          </w:p>
+        </w:tc>
+        <w:tc>
+          <w:tcPr>
+            <w:tcW w:w="1939" w:type="dxa"/>
+          </w:tcPr>
+          <w:p>
+            <w:pPr>
+              <w:rPr>
+                <w:rFonts w:ascii="Times New Roman" w:hAnsi="Times New Roman" w:cs="Times New Roman"/>
+                <w:lang w:val="en-CA"/>
+              </w:rPr>
+            </w:pPr>
+          </w:p>
+        </w:tc>
+      </w:tr>
+      <w:tr>
+        <w:trPr>
+          <w:trHeight w:val="462"/>
+          <w:tblCellSpacing w:w="15" w:type="dxa"/>
+        </w:trPr>
+        <w:tc>
+          <w:tcPr>
+            <w:tcW w:w="0" w:type="auto"/>
+            <w:vAlign w:val="center"/>
+          </w:tcPr>
+          <w:p>
+            <w:pPr>
+              <w:rPr>
+                <w:rFonts w:ascii="Times New Roman" w:hAnsi="Times New Roman" w:cs="Times New Roman"/>
+              </w:rPr>
+            </w:pPr>
+            <w:r>
+              <w:rPr>
+                <w:rFonts w:ascii="Times New Roman" w:hAnsi="Times New Roman" w:cs="Times New Roman"/>
+              </w:rPr>
+              <w:t>PSRAM</w:t>
+            </w:r>
+          </w:p>
+        </w:tc>
+        <w:tc>
+          <w:tcPr>
+            <w:tcW w:w="0" w:type="auto"/>
+            <w:vAlign w:val="center"/>
+          </w:tcPr>
+          <w:p>
+            <w:pPr>
+              <w:jc w:val="center"/>
+              <w:rPr>
+                <w:rFonts w:ascii="Times New Roman" w:hAnsi="Times New Roman" w:cs="Times New Roman"/>
+                <w:lang w:val="en-CA"/>
+              </w:rPr>
+            </w:pPr>
+            <w:r>
+              <w:rPr>
+                <w:rFonts w:ascii="Times New Roman" w:hAnsi="Times New Roman" w:cs="Times New Roman"/>
+                <w:lang w:val="en-CA"/>
+              </w:rPr>
+              <w:t>1</w:t>
+            </w:r>
+          </w:p>
+        </w:tc>
+        <w:tc>
+          <w:tcPr>
+            <w:tcW w:w="1491" w:type="dxa"/>
+            <w:vAlign w:val="center"/>
+          </w:tcPr>
+          <w:p>
+            <w:pPr>
+              <w:jc w:val="center"/>
+              <w:rPr>
+                <w:rFonts w:ascii="Times New Roman" w:hAnsi="Times New Roman" w:cs="Times New Roman"/>
+                <w:lang w:val="en-CA"/>
+              </w:rPr>
+            </w:pPr>
+            <w:r>
+              <w:rPr>
+                <w:rFonts w:ascii="Times New Roman" w:hAnsi="Times New Roman" w:cs="Times New Roman"/>
+              </w:rPr>
+              <w:t>7 mA</w:t>
+            </w:r>
+          </w:p>
+        </w:tc>
+        <w:tc>
+          <w:tcPr>
+            <w:tcW w:w="1530" w:type="dxa"/>
+          </w:tcPr>
+          <w:p>
+            <w:pPr>
+              <w:jc w:val="center"/>
+              <w:rPr>
+                <w:rFonts w:ascii="Times New Roman" w:hAnsi="Times New Roman" w:cs="Times New Roman"/>
+                <w:lang w:val="en-CA"/>
+              </w:rPr>
+            </w:pPr>
+            <w:r>
+              <w:rPr>
+                <w:rFonts w:ascii="Times New Roman" w:hAnsi="Times New Roman" w:cs="Times New Roman"/>
+              </w:rPr>
+              <w:t>7 mA</w:t>
+            </w:r>
+          </w:p>
+        </w:tc>
+        <w:tc>
+          <w:tcPr>
+            <w:tcW w:w="1939" w:type="dxa"/>
+          </w:tcPr>
+          <w:p>
+            <w:pPr>
+              <w:rPr>
+                <w:rFonts w:ascii="Times New Roman" w:hAnsi="Times New Roman" w:cs="Times New Roman"/>
+                <w:lang w:val="en-CA"/>
+              </w:rPr>
+            </w:pPr>
+          </w:p>
+        </w:tc>
+      </w:tr>
+      <w:tr>
+        <w:trPr>
+          <w:trHeight w:val="462"/>
+          <w:tblCellSpacing w:w="15" w:type="dxa"/>
+        </w:trPr>
+        <w:tc>
+          <w:tcPr>
+            <w:tcW w:w="0" w:type="auto"/>
+            <w:vAlign w:val="center"/>
+          </w:tcPr>
+          <w:p>
+            <w:pPr>
+              <w:rPr>
+                <w:rFonts w:ascii="Times New Roman" w:hAnsi="Times New Roman" w:cs="Times New Roman"/>
+              </w:rPr>
+            </w:pPr>
+            <w:r>
+              <w:rPr>
+                <w:rFonts w:ascii="Times New Roman" w:hAnsi="Times New Roman" w:cs="Times New Roman"/>
+              </w:rPr>
+              <w:t>MCU RT1062</w:t>
+            </w:r>
+          </w:p>
+        </w:tc>
+        <w:tc>
+          <w:tcPr>
+            <w:tcW w:w="0" w:type="auto"/>
+            <w:vAlign w:val="center"/>
+          </w:tcPr>
+          <w:p>
+            <w:pPr>
+              <w:jc w:val="center"/>
+              <w:rPr>
+                <w:rFonts w:ascii="Times New Roman" w:hAnsi="Times New Roman" w:cs="Times New Roman"/>
+                <w:lang w:val="en-CA"/>
+              </w:rPr>
+            </w:pPr>
+            <w:r>
+              <w:rPr>
+                <w:rFonts w:ascii="Times New Roman" w:hAnsi="Times New Roman" w:cs="Times New Roman"/>
+                <w:lang w:val="en-CA"/>
+              </w:rPr>
+              <w:t>1</w:t>
+            </w:r>
+          </w:p>
+        </w:tc>
+        <w:tc>
+          <w:tcPr>
+            <w:tcW w:w="1491" w:type="dxa"/>
+            <w:vAlign w:val="center"/>
+          </w:tcPr>
+          <w:p>
+            <w:pPr>
+              <w:jc w:val="center"/>
+              <w:rPr>
+                <w:rFonts w:ascii="Times New Roman" w:hAnsi="Times New Roman" w:cs="Times New Roman"/>
+                <w:lang w:val="en-CA"/>
+              </w:rPr>
+            </w:pPr>
+            <w:r>
+              <w:rPr>
+                <w:rFonts w:ascii="Times New Roman" w:hAnsi="Times New Roman" w:cs="Times New Roman"/>
+                <w:lang w:val="en-CA"/>
+              </w:rPr>
+              <w:t>100</w:t>
+            </w:r>
+            <w:r>
+              <w:rPr>
+                <w:rFonts w:ascii="Times New Roman" w:hAnsi="Times New Roman" w:cs="Times New Roman"/>
+                <w:lang w:val="en-CA"/>
+              </w:rPr>
+              <w:t xml:space="preserve"> </w:t>
+            </w:r>
+            <w:r>
+              <w:rPr>
+                <w:rFonts w:ascii="Times New Roman" w:hAnsi="Times New Roman" w:cs="Times New Roman"/>
+                <w:lang w:val="en-CA"/>
+              </w:rPr>
+              <w:t>mA</w:t>
+            </w:r>
+          </w:p>
+        </w:tc>
+        <w:tc>
+          <w:tcPr>
+            <w:tcW w:w="1530" w:type="dxa"/>
+          </w:tcPr>
+          <w:p>
+            <w:pPr>
+              <w:jc w:val="center"/>
+              <w:rPr>
+                <w:rFonts w:ascii="Times New Roman" w:hAnsi="Times New Roman" w:cs="Times New Roman"/>
+                <w:lang w:val="en-CA"/>
+              </w:rPr>
+            </w:pPr>
+            <w:r>
+              <w:rPr>
+                <w:rFonts w:ascii="Times New Roman" w:hAnsi="Times New Roman" w:cs="Times New Roman"/>
+                <w:lang w:val="en-CA"/>
+              </w:rPr>
+              <w:t>100</w:t>
+            </w:r>
+            <w:r>
+              <w:rPr>
+                <w:rFonts w:ascii="Times New Roman" w:hAnsi="Times New Roman" w:cs="Times New Roman"/>
+                <w:lang w:val="en-CA"/>
+              </w:rPr>
+              <w:t xml:space="preserve"> </w:t>
+            </w:r>
+            <w:r>
+              <w:rPr>
+                <w:rFonts w:ascii="Times New Roman" w:hAnsi="Times New Roman" w:cs="Times New Roman"/>
+                <w:lang w:val="en-CA"/>
+              </w:rPr>
+              <w:t>mA</w:t>
+            </w:r>
+          </w:p>
+        </w:tc>
+        <w:tc>
+          <w:tcPr>
+            <w:tcW w:w="1939" w:type="dxa"/>
+          </w:tcPr>
+          <w:p>
+            <w:pPr>
+              <w:rPr>
+                <w:rFonts w:ascii="Times New Roman" w:hAnsi="Times New Roman" w:cs="Times New Roman"/>
+                <w:lang w:val="en-CA"/>
+              </w:rPr>
+            </w:pPr>
+          </w:p>
+        </w:tc>
+      </w:tr>
+      <w:tr>
+        <w:trPr>
+          <w:trHeight w:val="462"/>
+          <w:tblCellSpacing w:w="15" w:type="dxa"/>
+        </w:trPr>
+        <w:tc>
+          <w:tcPr>
+            <w:tcW w:w="0" w:type="auto"/>
+            <w:vAlign w:val="center"/>
+          </w:tcPr>
+          <w:p>
+            <w:pPr>
+              <w:rPr>
+                <w:rFonts w:ascii="Times New Roman" w:hAnsi="Times New Roman" w:cs="Times New Roman"/>
+              </w:rPr>
+            </w:pPr>
+            <w:r>
+              <w:rPr>
+                <w:rFonts w:ascii="Times New Roman" w:hAnsi="Times New Roman" w:cs="Times New Roman"/>
+              </w:rPr>
+              <w:lastRenderedPageBreak/>
+              <w:t>LED HSMF-C169</w:t>
+            </w:r>
+          </w:p>
+        </w:tc>
+        <w:tc>
+          <w:tcPr>
+            <w:tcW w:w="0" w:type="auto"/>
+            <w:vAlign w:val="center"/>
+          </w:tcPr>
+          <w:p>
+            <w:pPr>
+              <w:jc w:val="center"/>
+              <w:rPr>
+                <w:rFonts w:ascii="Times New Roman" w:hAnsi="Times New Roman" w:cs="Times New Roman"/>
+                <w:lang w:val="en-CA"/>
+              </w:rPr>
+            </w:pPr>
+            <w:r>
+              <w:rPr>
+                <w:rFonts w:ascii="Times New Roman" w:hAnsi="Times New Roman" w:cs="Times New Roman"/>
+                <w:lang w:val="en-CA"/>
+              </w:rPr>
+              <w:t>6</w:t>
+            </w:r>
+          </w:p>
+        </w:tc>
+        <w:tc>
+          <w:tcPr>
+            <w:tcW w:w="1491" w:type="dxa"/>
+            <w:vAlign w:val="center"/>
+          </w:tcPr>
+          <w:p>
+            <w:pPr>
+              <w:jc w:val="center"/>
+              <w:rPr>
+                <w:rFonts w:ascii="Times New Roman" w:hAnsi="Times New Roman" w:cs="Times New Roman"/>
+                <w:lang w:val="en-CA"/>
+              </w:rPr>
+            </w:pPr>
+            <w:r>
+              <w:rPr>
+                <w:rFonts w:ascii="Times New Roman" w:hAnsi="Times New Roman" w:cs="Times New Roman"/>
+                <w:lang w:val="en-CA"/>
+              </w:rPr>
+              <w:t>5</w:t>
+            </w:r>
+            <w:r>
+              <w:rPr>
+                <w:rFonts w:ascii="Times New Roman" w:hAnsi="Times New Roman" w:cs="Times New Roman"/>
+                <w:lang w:val="en-CA"/>
+              </w:rPr>
+              <w:t xml:space="preserve"> </w:t>
+            </w:r>
+            <w:r>
+              <w:rPr>
+                <w:rFonts w:ascii="Times New Roman" w:hAnsi="Times New Roman" w:cs="Times New Roman"/>
+                <w:lang w:val="en-CA"/>
+              </w:rPr>
+              <w:t>mA</w:t>
+            </w:r>
+          </w:p>
+        </w:tc>
+        <w:tc>
+          <w:tcPr>
+            <w:tcW w:w="1530" w:type="dxa"/>
+          </w:tcPr>
+          <w:p>
+            <w:pPr>
+              <w:jc w:val="center"/>
+              <w:rPr>
+                <w:rFonts w:ascii="Times New Roman" w:hAnsi="Times New Roman" w:cs="Times New Roman"/>
+                <w:lang w:val="en-CA"/>
+              </w:rPr>
+            </w:pPr>
+            <w:r>
+              <w:rPr>
+                <w:rFonts w:ascii="Times New Roman" w:hAnsi="Times New Roman" w:cs="Times New Roman"/>
+                <w:lang w:val="en-CA"/>
+              </w:rPr>
+              <w:t>30</w:t>
+            </w:r>
+            <w:r>
+              <w:rPr>
+                <w:rFonts w:ascii="Times New Roman" w:hAnsi="Times New Roman" w:cs="Times New Roman"/>
+                <w:lang w:val="en-CA"/>
+              </w:rPr>
+              <w:t xml:space="preserve"> </w:t>
+            </w:r>
+            <w:r>
+              <w:rPr>
+                <w:rFonts w:ascii="Times New Roman" w:hAnsi="Times New Roman" w:cs="Times New Roman"/>
+                <w:lang w:val="en-CA"/>
+              </w:rPr>
+              <w:t>mA</w:t>
+            </w:r>
+          </w:p>
+        </w:tc>
+        <w:tc>
+          <w:tcPr>
+            <w:tcW w:w="1939" w:type="dxa"/>
+          </w:tcPr>
+          <w:p>
+            <w:pPr>
+              <w:rPr>
+                <w:rFonts w:ascii="Times New Roman" w:hAnsi="Times New Roman" w:cs="Times New Roman"/>
+                <w:lang w:val="en-CA"/>
+              </w:rPr>
+            </w:pPr>
+          </w:p>
+        </w:tc>
+      </w:tr>
+      <w:tr>
+        <w:trPr>
+          <w:trHeight w:val="462"/>
+          <w:tblCellSpacing w:w="15" w:type="dxa"/>
+        </w:trPr>
+        <w:tc>
+          <w:tcPr>
+            <w:tcW w:w="0" w:type="auto"/>
+            <w:vAlign w:val="center"/>
+          </w:tcPr>
+          <w:p>
+            <w:pPr>
+              <w:rPr>
+                <w:rFonts w:ascii="Times New Roman" w:hAnsi="Times New Roman" w:cs="Times New Roman"/>
+                <w:b/>
+                <w:bCs/>
+              </w:rPr>
+            </w:pPr>
+            <w:r>
+              <w:rPr>
+                <w:rFonts w:ascii="Times New Roman" w:hAnsi="Times New Roman" w:cs="Times New Roman"/>
+                <w:b/>
+                <w:bCs/>
+                <w:lang w:val="en-CA"/>
+              </w:rPr>
+              <w:t>Total (50% Margin of Safety)</w:t>
+            </w:r>
+          </w:p>
+        </w:tc>
+        <w:tc>
+          <w:tcPr>
+            <w:tcW w:w="0" w:type="auto"/>
+            <w:vAlign w:val="center"/>
+          </w:tcPr>
+          <w:p>
+            <w:pPr>
+              <w:jc w:val="center"/>
+              <w:rPr>
+                <w:rFonts w:ascii="Times New Roman" w:hAnsi="Times New Roman" w:cs="Times New Roman"/>
+                <w:lang w:val="en-CA"/>
+              </w:rPr>
+            </w:pPr>
+          </w:p>
+        </w:tc>
+        <w:tc>
+          <w:tcPr>
+            <w:tcW w:w="1491" w:type="dxa"/>
+            <w:vAlign w:val="center"/>
+          </w:tcPr>
+          <w:p>
+            <w:pPr>
+              <w:jc w:val="center"/>
+              <w:rPr>
+                <w:rFonts w:ascii="Times New Roman" w:hAnsi="Times New Roman" w:cs="Times New Roman"/>
+                <w:lang w:val="en-CA"/>
+              </w:rPr>
+            </w:pPr>
+          </w:p>
+        </w:tc>
+        <w:tc>
+          <w:tcPr>
+            <w:tcW w:w="1530" w:type="dxa"/>
+          </w:tcPr>
+          <w:p>
+            <w:pPr>
+              <w:jc w:val="center"/>
+              <w:rPr>
+                <w:rFonts w:ascii="Times New Roman" w:hAnsi="Times New Roman" w:cs="Times New Roman"/>
+                <w:lang w:val="en-CA"/>
+              </w:rPr>
+            </w:pPr>
+            <w:r>
+              <w:rPr>
+                <w:rFonts w:ascii="Times New Roman" w:hAnsi="Times New Roman" w:cs="Times New Roman"/>
+              </w:rPr>
+              <w:t>388.295 mA</w:t>
+            </w:r>
+            <w:r>
+              <w:rPr>
+                <w:rFonts w:ascii="Times New Roman" w:hAnsi="Times New Roman" w:cs="Times New Roman"/>
+              </w:rPr>
+              <w:t xml:space="preserve"> *1.5 = </w:t>
+            </w:r>
+            <w:r>
+              <w:rPr>
+                <w:rFonts w:ascii="Times New Roman" w:hAnsi="Times New Roman" w:cs="Times New Roman"/>
+              </w:rPr>
+              <w:t>0.6 A</w:t>
+            </w:r>
+          </w:p>
+        </w:tc>
+        <w:tc>
+          <w:tcPr>
+            <w:tcW w:w="1939" w:type="dxa"/>
+          </w:tcPr>
+          <w:p>
+            <w:pPr>
+              <w:rPr>
+                <w:rFonts w:ascii="Times New Roman" w:hAnsi="Times New Roman" w:cs="Times New Roman"/>
+                <w:lang w:val="en-CA"/>
+              </w:rPr>
+            </w:pPr>
+          </w:p>
+        </w:tc>
+      </w:tr>
+    </w:tbl>
+    <w:p>
+      <w:pPr>
+        <w:rPr>
+          <w:rFonts w:ascii="Times New Roman" w:hAnsi="Times New Roman" w:cs="Times New Roman"/>
+          <w:b/>
+          <w:bCs/>
+          <w:lang w:val="en-CA"/>
+        </w:rPr>
+      </w:pPr>
+    </w:p>
+    <w:p>
+      <w:pPr>
         <w:pStyle w:val="Heading1"/>
+        <w:ind w:left="360"/>
         <w:rPr>
           <w:lang w:val="en-CA"/>
         </w:rPr>
@@ -4942,7 +7700,7 @@
           <w:lang w:val="en-CA"/>
         </w:rPr>
         <w:pict w14:anchorId="38AC0D27">
-          <v:rect id="_x0000_i1420" style="width:0;height:1.5pt" o:hralign="center" o:hrstd="t" o:hr="t" fillcolor="#a0a0a0" stroked="f"/>
+          <v:rect id="_x0000_i1030" style="width:0;height:1.5pt" o:hralign="center" o:hrstd="t" o:hr="t" fillcolor="#a0a0a0" stroked="f"/>
         </w:pict>
       </w:r>
     </w:p>
@@ -5619,6 +8377,7 @@
                 <w:rFonts w:ascii="Times New Roman" w:hAnsi="Times New Roman" w:cs="Times New Roman"/>
                 <w:lang w:val="en-CA"/>
               </w:rPr>
+              <w:lastRenderedPageBreak/>
               <w:t>SCK</w:t>
             </w:r>
           </w:p>
@@ -5668,7 +8427,6 @@
                 <w:rFonts w:ascii="Times New Roman" w:hAnsi="Times New Roman" w:cs="Times New Roman"/>
                 <w:lang w:val="en-CA"/>
               </w:rPr>
-              <w:lastRenderedPageBreak/>
               <w:t>CS</w:t>
             </w:r>
           </w:p>
@@ -5710,7 +8468,7 @@
           <w:lang w:val="en-CA"/>
         </w:rPr>
         <w:pict w14:anchorId="3B816610">
-          <v:rect id="_x0000_i1421" style="width:0;height:1.5pt" o:hralign="center" o:hrstd="t" o:hr="t" fillcolor="#a0a0a0" stroked="f"/>
+          <v:rect id="_x0000_i1031" style="width:0;height:1.5pt" o:hralign="center" o:hrstd="t" o:hr="t" fillcolor="#a0a0a0" stroked="f"/>
         </w:pict>
       </w:r>
     </w:p>
@@ -6552,6 +9310,7 @@
                 <w:rFonts w:ascii="Times New Roman" w:hAnsi="Times New Roman" w:cs="Times New Roman"/>
                 <w:lang w:val="en-CA"/>
               </w:rPr>
+              <w:lastRenderedPageBreak/>
               <w:t>Purpose</w:t>
             </w:r>
           </w:p>
@@ -6592,9 +9351,8 @@
           <w:rFonts w:ascii="Times New Roman" w:hAnsi="Times New Roman" w:cs="Times New Roman"/>
           <w:lang w:val="en-CA"/>
         </w:rPr>
-        <w:lastRenderedPageBreak/>
         <w:pict w14:anchorId="6E3545EE">
-          <v:rect id="_x0000_i1422" style="width:0;height:1.5pt" o:hralign="center" o:hrstd="t" o:hr="t" fillcolor="#a0a0a0" stroked="f"/>
+          <v:rect id="_x0000_i1032" style="width:0;height:1.5pt" o:hralign="center" o:hrstd="t" o:hr="t" fillcolor="#a0a0a0" stroked="f"/>
         </w:pict>
       </w:r>
     </w:p>
@@ -6950,7 +9708,7 @@
           <w:lang w:val="en-CA"/>
         </w:rPr>
         <w:pict w14:anchorId="0CC8BEAA">
-          <v:rect id="_x0000_i1423" style="width:0;height:1.5pt" o:hralign="center" o:hrstd="t" o:hr="t" fillcolor="#a0a0a0" stroked="f"/>
+          <v:rect id="_x0000_i1033" style="width:0;height:1.5pt" o:hralign="center" o:hrstd="t" o:hr="t" fillcolor="#a0a0a0" stroked="f"/>
         </w:pict>
       </w:r>
     </w:p>
@@ -7159,7 +9917,7 @@
           <w:lang w:val="en-CA"/>
         </w:rPr>
         <w:pict w14:anchorId="0C473556">
-          <v:rect id="_x0000_i1424" style="width:0;height:1.5pt" o:hralign="center" o:hrstd="t" o:hr="t" fillcolor="#a0a0a0" stroked="f"/>
+          <v:rect id="_x0000_i1034" style="width:0;height:1.5pt" o:hralign="center" o:hrstd="t" o:hr="t" fillcolor="#a0a0a0" stroked="f"/>
         </w:pict>
       </w:r>
     </w:p>
@@ -7233,6 +9991,7 @@
           <w:rFonts w:ascii="Times New Roman" w:hAnsi="Times New Roman" w:cs="Times New Roman"/>
           <w:lang w:val="en-CA"/>
         </w:rPr>
+        <w:lastRenderedPageBreak/>
         <w:t>Sensor accuracy depends on power integrity and layout</w:t>
       </w:r>
     </w:p>
@@ -7268,7 +10027,7 @@
           <w:lang w:val="en-CA"/>
         </w:rPr>
         <w:pict w14:anchorId="22D5D2DA">
-          <v:rect id="_x0000_i1425" style="width:0;height:1.5pt" o:hralign="center" o:hrstd="t" o:hr="t" fillcolor="#a0a0a0" stroked="f"/>
+          <v:rect id="_x0000_i1035" style="width:0;height:1.5pt" o:hralign="center" o:hrstd="t" o:hr="t" fillcolor="#a0a0a0" stroked="f"/>
         </w:pict>
       </w:r>
     </w:p>
@@ -7284,7 +10043,6 @@
         <w:rPr>
           <w:lang w:val="en-CA"/>
         </w:rPr>
-        <w:lastRenderedPageBreak/>
         <w:t>10. Verification and Validation</w:t>
       </w:r>
       <w:bookmarkEnd w:id="28"/>
@@ -7393,7 +10151,7 @@
           <w:lang w:val="en-CA"/>
         </w:rPr>
         <w:pict w14:anchorId="1A64E174">
-          <v:rect id="_x0000_i1427" style="width:0;height:1.5pt" o:hralign="center" o:hrstd="t" o:hr="t" fillcolor="#a0a0a0" stroked="f"/>
+          <v:rect id="_x0000_i1036" style="width:0;height:1.5pt" o:hralign="center" o:hrstd="t" o:hr="t" fillcolor="#a0a0a0" stroked="f"/>
         </w:pict>
       </w:r>
     </w:p>
@@ -7646,8 +10404,63 @@
 </w:document>
 </file>
 
+<file path=word/endnotes.xml><?xml version="1.0" encoding="utf-8"?>
+<w:endnotes xmlns:wpc="http://schemas.microsoft.com/office/word/2010/wordprocessingCanvas" xmlns:cx="http://schemas.microsoft.com/office/drawing/2014/chartex" xmlns:cx1="http://schemas.microsoft.com/office/drawing/2015/9/8/chartex" xmlns:cx2="http://schemas.microsoft.com/office/drawing/2015/10/21/chartex" xmlns:cx3="http://schemas.microsoft.com/office/drawing/2016/5/9/chartex" xmlns:cx4="http://schemas.microsoft.com/office/drawing/2016/5/10/chartex" xmlns:cx5="http://schemas.microsoft.com/office/drawing/2016/5/11/chartex" xmlns:cx6="http://schemas.microsoft.com/office/drawing/2016/5/12/chartex" xmlns:cx7="http://schemas.microsoft.com/office/drawing/2016/5/13/chartex" xmlns:cx8="http://schemas.microsoft.com/office/drawing/2016/5/14/chartex" xmlns:mc="http://schemas.openxmlformats.org/markup-compatibility/2006" xmlns:aink="http://schemas.microsoft.com/office/drawing/2016/ink" xmlns:am3d="http://schemas.microsoft.com/office/drawing/2017/model3d" xmlns:o="urn:schemas-microsoft-com:office:office" xmlns:oel="http://schemas.microsoft.com/office/2019/extlst" xmlns:r="http://schemas.openxmlformats.org/officeDocument/2006/relationships" xmlns:m="http://schemas.openxmlformats.org/officeDocument/2006/math" xmlns:v="urn:schemas-microsoft-com:vml" xmlns:wp14="http://schemas.microsoft.com/office/word/2010/wordprocessingDrawing" xmlns:wp="http://schemas.openxmlformats.org/drawingml/2006/wordprocessingDrawing" xmlns:w10="urn:schemas-microsoft-com:office:word" xmlns:w="http://schemas.openxmlformats.org/wordprocessingml/2006/main" xmlns:w14="http://schemas.microsoft.com/office/word/2010/wordml" xmlns:w15="http://schemas.microsoft.com/office/word/2012/wordml" xmlns:w16cex="http://schemas.microsoft.com/office/word/2018/wordml/cex" xmlns:w16cid="http://schemas.microsoft.com/office/word/2016/wordml/cid" xmlns:w16="http://schemas.microsoft.com/office/word/2018/wordml" xmlns:w16sdtdh="http://schemas.microsoft.com/office/word/2020/wordml/sdtdatahash" xmlns:w16se="http://schemas.microsoft.com/office/word/2015/wordml/symex" xmlns:wpg="http://schemas.microsoft.com/office/word/2010/wordprocessingGroup" xmlns:wpi="http://schemas.microsoft.com/office/word/2010/wordprocessingInk" xmlns:wne="http://schemas.microsoft.com/office/word/2006/wordml" xmlns:wps="http://schemas.microsoft.com/office/word/2010/wordprocessingShape" mc:Ignorable="w14 w15 w16se w16cid w16 w16cex w16sdtdh wp14">
+  <w:endnote w:type="separator" w:id="-1">
+    <w:p>
+      <w:pPr>
+        <w:spacing w:after="0" w:line="240" w:lineRule="auto"/>
+      </w:pPr>
+      <w:r>
+        <w:separator/>
+      </w:r>
+    </w:p>
+  </w:endnote>
+  <w:endnote w:type="continuationSeparator" w:id="0">
+    <w:p>
+      <w:pPr>
+        <w:spacing w:after="0" w:line="240" w:lineRule="auto"/>
+      </w:pPr>
+      <w:r>
+        <w:continuationSeparator/>
+      </w:r>
+    </w:p>
+  </w:endnote>
+</w:endnotes>
+</file>
+
+<file path=word/footnotes.xml><?xml version="1.0" encoding="utf-8"?>
+<w:footnotes xmlns:wpc="http://schemas.microsoft.com/office/word/2010/wordprocessingCanvas" xmlns:cx="http://schemas.microsoft.com/office/drawing/2014/chartex" xmlns:cx1="http://schemas.microsoft.com/office/drawing/2015/9/8/chartex" xmlns:cx2="http://schemas.microsoft.com/office/drawing/2015/10/21/chartex" xmlns:cx3="http://schemas.microsoft.com/office/drawing/2016/5/9/chartex" xmlns:cx4="http://schemas.microsoft.com/office/drawing/2016/5/10/chartex" xmlns:cx5="http://schemas.microsoft.com/office/drawing/2016/5/11/chartex" xmlns:cx6="http://schemas.microsoft.com/office/drawing/2016/5/12/chartex" xmlns:cx7="http://schemas.microsoft.com/office/drawing/2016/5/13/chartex" xmlns:cx8="http://schemas.microsoft.com/office/drawing/2016/5/14/chartex" xmlns:mc="http://schemas.openxmlformats.org/markup-compatibility/2006" xmlns:aink="http://schemas.microsoft.com/office/drawing/2016/ink" xmlns:am3d="http://schemas.microsoft.com/office/drawing/2017/model3d" xmlns:o="urn:schemas-microsoft-com:office:office" xmlns:oel="http://schemas.microsoft.com/office/2019/extlst" xmlns:r="http://schemas.openxmlformats.org/officeDocument/2006/relationships" xmlns:m="http://schemas.openxmlformats.org/officeDocument/2006/math" xmlns:v="urn:schemas-microsoft-com:vml" xmlns:wp14="http://schemas.microsoft.com/office/word/2010/wordprocessingDrawing" xmlns:wp="http://schemas.openxmlformats.org/drawingml/2006/wordprocessingDrawing" xmlns:w10="urn:schemas-microsoft-com:office:word" xmlns:w="http://schemas.openxmlformats.org/wordprocessingml/2006/main" xmlns:w14="http://schemas.microsoft.com/office/word/2010/wordml" xmlns:w15="http://schemas.microsoft.com/office/word/2012/wordml" xmlns:w16cex="http://schemas.microsoft.com/office/word/2018/wordml/cex" xmlns:w16cid="http://schemas.microsoft.com/office/word/2016/wordml/cid" xmlns:w16="http://schemas.microsoft.com/office/word/2018/wordml" xmlns:w16sdtdh="http://schemas.microsoft.com/office/word/2020/wordml/sdtdatahash" xmlns:w16se="http://schemas.microsoft.com/office/word/2015/wordml/symex" xmlns:wpg="http://schemas.microsoft.com/office/word/2010/wordprocessingGroup" xmlns:wpi="http://schemas.microsoft.com/office/word/2010/wordprocessingInk" xmlns:wne="http://schemas.microsoft.com/office/word/2006/wordml" xmlns:wps="http://schemas.microsoft.com/office/word/2010/wordprocessingShape" mc:Ignorable="w14 w15 w16se w16cid w16 w16cex w16sdtdh wp14">
+  <w:footnote w:type="separator" w:id="-1">
+    <w:p>
+      <w:pPr>
+        <w:spacing w:after="0" w:line="240" w:lineRule="auto"/>
+      </w:pPr>
+      <w:r>
+        <w:separator/>
+      </w:r>
+    </w:p>
+  </w:footnote>
+  <w:footnote w:type="continuationSeparator" w:id="0">
+    <w:p>
+      <w:pPr>
+        <w:spacing w:after="0" w:line="240" w:lineRule="auto"/>
+      </w:pPr>
+      <w:r>
+        <w:continuationSeparator/>
+      </w:r>
+    </w:p>
+  </w:footnote>
+</w:footnotes>
+</file>
+
 <file path=word/numbering.xml><?xml version="1.0" encoding="utf-8"?>
 <w:numbering xmlns:wpc="http://schemas.microsoft.com/office/word/2010/wordprocessingCanvas" xmlns:cx="http://schemas.microsoft.com/office/drawing/2014/chartex" xmlns:cx1="http://schemas.microsoft.com/office/drawing/2015/9/8/chartex" xmlns:cx2="http://schemas.microsoft.com/office/drawing/2015/10/21/chartex" xmlns:cx3="http://schemas.microsoft.com/office/drawing/2016/5/9/chartex" xmlns:cx4="http://schemas.microsoft.com/office/drawing/2016/5/10/chartex" xmlns:cx5="http://schemas.microsoft.com/office/drawing/2016/5/11/chartex" xmlns:cx6="http://schemas.microsoft.com/office/drawing/2016/5/12/chartex" xmlns:cx7="http://schemas.microsoft.com/office/drawing/2016/5/13/chartex" xmlns:cx8="http://schemas.microsoft.com/office/drawing/2016/5/14/chartex" xmlns:mc="http://schemas.openxmlformats.org/markup-compatibility/2006" xmlns:aink="http://schemas.microsoft.com/office/drawing/2016/ink" xmlns:am3d="http://schemas.microsoft.com/office/drawing/2017/model3d" xmlns:o="urn:schemas-microsoft-com:office:office" xmlns:oel="http://schemas.microsoft.com/office/2019/extlst" xmlns:r="http://schemas.openxmlformats.org/officeDocument/2006/relationships" xmlns:m="http://schemas.openxmlformats.org/officeDocument/2006/math" xmlns:v="urn:schemas-microsoft-com:vml" xmlns:wp14="http://schemas.microsoft.com/office/word/2010/wordprocessingDrawing" xmlns:wp="http://schemas.openxmlformats.org/drawingml/2006/wordprocessingDrawing" xmlns:w10="urn:schemas-microsoft-com:office:word" xmlns:w="http://schemas.openxmlformats.org/wordprocessingml/2006/main" xmlns:w14="http://schemas.microsoft.com/office/word/2010/wordml" xmlns:w15="http://schemas.microsoft.com/office/word/2012/wordml" xmlns:w16cex="http://schemas.microsoft.com/office/word/2018/wordml/cex" xmlns:w16cid="http://schemas.microsoft.com/office/word/2016/wordml/cid" xmlns:w16="http://schemas.microsoft.com/office/word/2018/wordml" xmlns:w16sdtdh="http://schemas.microsoft.com/office/word/2020/wordml/sdtdatahash" xmlns:w16se="http://schemas.microsoft.com/office/word/2015/wordml/symex" xmlns:wpg="http://schemas.microsoft.com/office/word/2010/wordprocessingGroup" xmlns:wpi="http://schemas.microsoft.com/office/word/2010/wordprocessingInk" xmlns:wne="http://schemas.microsoft.com/office/word/2006/wordml" xmlns:wps="http://schemas.microsoft.com/office/word/2010/wordprocessingShape" mc:Ignorable="w14 w15 w16se w16cid w16 w16cex w16sdtdh wp14">
+  <w:numPicBullet w:numPicBulletId="0">
+    <w:pict>
+      <v:rect id="_x0000_i1037" style="width:0;height:1.5pt" o:hralign="center" o:bullet="t" o:hrstd="t" o:hr="t" fillcolor="#a0a0a0" stroked="f"/>
+    </w:pict>
+  </w:numPicBullet>
   <w:abstractNum w:abstractNumId="0" w15:restartNumberingAfterBreak="0">
     <w:nsid w:val="08FF4B9B"/>
     <w:multiLevelType w:val="multilevel"/>
@@ -7798,6 +10611,147 @@
     </w:lvl>
   </w:abstractNum>
   <w:abstractNum w:abstractNumId="1" w15:restartNumberingAfterBreak="0">
+    <w:nsid w:val="0E9C3B38"/>
+    <w:multiLevelType w:val="hybridMultilevel"/>
+    <w:tmpl w:val="40DA8050"/>
+    <w:lvl w:ilvl="0" w:tplc="0D7CC944">
+      <w:start w:val="1"/>
+      <w:numFmt w:val="bullet"/>
+      <w:lvlText w:val=""/>
+      <w:lvlPicBulletId w:val="0"/>
+      <w:lvlJc w:val="left"/>
+      <w:pPr>
+        <w:tabs>
+          <w:tab w:val="num" w:pos="720"/>
+        </w:tabs>
+        <w:ind w:left="720" w:hanging="360"/>
+      </w:pPr>
+      <w:rPr>
+        <w:rFonts w:ascii="Symbol" w:hAnsi="Symbol" w:hint="default"/>
+      </w:rPr>
+    </w:lvl>
+    <w:lvl w:ilvl="1" w:tplc="AB2E8146" w:tentative="1">
+      <w:start w:val="1"/>
+      <w:numFmt w:val="bullet"/>
+      <w:lvlText w:val=""/>
+      <w:lvlJc w:val="left"/>
+      <w:pPr>
+        <w:tabs>
+          <w:tab w:val="num" w:pos="1440"/>
+        </w:tabs>
+        <w:ind w:left="1440" w:hanging="360"/>
+      </w:pPr>
+      <w:rPr>
+        <w:rFonts w:ascii="Symbol" w:hAnsi="Symbol" w:hint="default"/>
+      </w:rPr>
+    </w:lvl>
+    <w:lvl w:ilvl="2" w:tplc="022A7514" w:tentative="1">
+      <w:start w:val="1"/>
+      <w:numFmt w:val="bullet"/>
+      <w:lvlText w:val=""/>
+      <w:lvlJc w:val="left"/>
+      <w:pPr>
+        <w:tabs>
+          <w:tab w:val="num" w:pos="2160"/>
+        </w:tabs>
+        <w:ind w:left="2160" w:hanging="360"/>
+      </w:pPr>
+      <w:rPr>
+        <w:rFonts w:ascii="Symbol" w:hAnsi="Symbol" w:hint="default"/>
+      </w:rPr>
+    </w:lvl>
+    <w:lvl w:ilvl="3" w:tplc="136218CE" w:tentative="1">
+      <w:start w:val="1"/>
+      <w:numFmt w:val="bullet"/>
+      <w:lvlText w:val=""/>
+      <w:lvlJc w:val="left"/>
+      <w:pPr>
+        <w:tabs>
+          <w:tab w:val="num" w:pos="2880"/>
+        </w:tabs>
+        <w:ind w:left="2880" w:hanging="360"/>
+      </w:pPr>
+      <w:rPr>
+        <w:rFonts w:ascii="Symbol" w:hAnsi="Symbol" w:hint="default"/>
+      </w:rPr>
+    </w:lvl>
+    <w:lvl w:ilvl="4" w:tplc="F2F09114" w:tentative="1">
+      <w:start w:val="1"/>
+      <w:numFmt w:val="bullet"/>
+      <w:lvlText w:val=""/>
+      <w:lvlJc w:val="left"/>
+      <w:pPr>
+        <w:tabs>
+          <w:tab w:val="num" w:pos="3600"/>
+        </w:tabs>
+        <w:ind w:left="3600" w:hanging="360"/>
+      </w:pPr>
+      <w:rPr>
+        <w:rFonts w:ascii="Symbol" w:hAnsi="Symbol" w:hint="default"/>
+      </w:rPr>
+    </w:lvl>
+    <w:lvl w:ilvl="5" w:tplc="2F9CE9CA" w:tentative="1">
+      <w:start w:val="1"/>
+      <w:numFmt w:val="bullet"/>
+      <w:lvlText w:val=""/>
+      <w:lvlJc w:val="left"/>
+      <w:pPr>
+        <w:tabs>
+          <w:tab w:val="num" w:pos="4320"/>
+        </w:tabs>
+        <w:ind w:left="4320" w:hanging="360"/>
+      </w:pPr>
+      <w:rPr>
+        <w:rFonts w:ascii="Symbol" w:hAnsi="Symbol" w:hint="default"/>
+      </w:rPr>
+    </w:lvl>
+    <w:lvl w:ilvl="6" w:tplc="80EA2800" w:tentative="1">
+      <w:start w:val="1"/>
+      <w:numFmt w:val="bullet"/>
+      <w:lvlText w:val=""/>
+      <w:lvlJc w:val="left"/>
+      <w:pPr>
+        <w:tabs>
+          <w:tab w:val="num" w:pos="5040"/>
+        </w:tabs>
+        <w:ind w:left="5040" w:hanging="360"/>
+      </w:pPr>
+      <w:rPr>
+        <w:rFonts w:ascii="Symbol" w:hAnsi="Symbol" w:hint="default"/>
+      </w:rPr>
+    </w:lvl>
+    <w:lvl w:ilvl="7" w:tplc="CF3A9B54" w:tentative="1">
+      <w:start w:val="1"/>
+      <w:numFmt w:val="bullet"/>
+      <w:lvlText w:val=""/>
+      <w:lvlJc w:val="left"/>
+      <w:pPr>
+        <w:tabs>
+          <w:tab w:val="num" w:pos="5760"/>
+        </w:tabs>
+        <w:ind w:left="5760" w:hanging="360"/>
+      </w:pPr>
+      <w:rPr>
+        <w:rFonts w:ascii="Symbol" w:hAnsi="Symbol" w:hint="default"/>
+      </w:rPr>
+    </w:lvl>
+    <w:lvl w:ilvl="8" w:tplc="77B86E4C" w:tentative="1">
+      <w:start w:val="1"/>
+      <w:numFmt w:val="bullet"/>
+      <w:lvlText w:val=""/>
+      <w:lvlJc w:val="left"/>
+      <w:pPr>
+        <w:tabs>
+          <w:tab w:val="num" w:pos="6480"/>
+        </w:tabs>
+        <w:ind w:left="6480" w:hanging="360"/>
+      </w:pPr>
+      <w:rPr>
+        <w:rFonts w:ascii="Symbol" w:hAnsi="Symbol" w:hint="default"/>
+      </w:rPr>
+    </w:lvl>
+  </w:abstractNum>
+  <w:abstractNum w:abstractNumId="2" w15:restartNumberingAfterBreak="0">
     <w:nsid w:val="11C14274"/>
     <w:multiLevelType w:val="multilevel"/>
     <w:tmpl w:val="428AFD36"/>
@@ -7946,7 +10900,7 @@
       </w:rPr>
     </w:lvl>
   </w:abstractNum>
-  <w:abstractNum w:abstractNumId="2" w15:restartNumberingAfterBreak="0">
+  <w:abstractNum w:abstractNumId="3" w15:restartNumberingAfterBreak="0">
     <w:nsid w:val="1553466C"/>
     <w:multiLevelType w:val="multilevel"/>
     <w:tmpl w:val="A81A6EF6"/>
@@ -8095,7 +11049,7 @@
       </w:rPr>
     </w:lvl>
   </w:abstractNum>
-  <w:abstractNum w:abstractNumId="3" w15:restartNumberingAfterBreak="0">
+  <w:abstractNum w:abstractNumId="4" w15:restartNumberingAfterBreak="0">
     <w:nsid w:val="160B4B57"/>
     <w:multiLevelType w:val="multilevel"/>
     <w:tmpl w:val="23362842"/>
@@ -8244,7 +11198,7 @@
       </w:rPr>
     </w:lvl>
   </w:abstractNum>
-  <w:abstractNum w:abstractNumId="4" w15:restartNumberingAfterBreak="0">
+  <w:abstractNum w:abstractNumId="5" w15:restartNumberingAfterBreak="0">
     <w:nsid w:val="18762777"/>
     <w:multiLevelType w:val="multilevel"/>
     <w:tmpl w:val="92568F3A"/>
@@ -8393,7 +11347,7 @@
       </w:rPr>
     </w:lvl>
   </w:abstractNum>
-  <w:abstractNum w:abstractNumId="5" w15:restartNumberingAfterBreak="0">
+  <w:abstractNum w:abstractNumId="6" w15:restartNumberingAfterBreak="0">
     <w:nsid w:val="1C470BF9"/>
     <w:multiLevelType w:val="multilevel"/>
     <w:tmpl w:val="E50A69FE"/>
@@ -8506,7 +11460,7 @@
       </w:pPr>
     </w:lvl>
   </w:abstractNum>
-  <w:abstractNum w:abstractNumId="6" w15:restartNumberingAfterBreak="0">
+  <w:abstractNum w:abstractNumId="7" w15:restartNumberingAfterBreak="0">
     <w:nsid w:val="1D410E62"/>
     <w:multiLevelType w:val="multilevel"/>
     <w:tmpl w:val="0CC0A25C"/>
@@ -8655,7 +11609,7 @@
       </w:rPr>
     </w:lvl>
   </w:abstractNum>
-  <w:abstractNum w:abstractNumId="7" w15:restartNumberingAfterBreak="0">
+  <w:abstractNum w:abstractNumId="8" w15:restartNumberingAfterBreak="0">
     <w:nsid w:val="23536873"/>
     <w:multiLevelType w:val="multilevel"/>
     <w:tmpl w:val="90082F1E"/>
@@ -8804,7 +11758,7 @@
       </w:rPr>
     </w:lvl>
   </w:abstractNum>
-  <w:abstractNum w:abstractNumId="8" w15:restartNumberingAfterBreak="0">
+  <w:abstractNum w:abstractNumId="9" w15:restartNumberingAfterBreak="0">
     <w:nsid w:val="2CE1759E"/>
     <w:multiLevelType w:val="multilevel"/>
     <w:tmpl w:val="F51E336C"/>
@@ -8953,7 +11907,7 @@
       </w:rPr>
     </w:lvl>
   </w:abstractNum>
-  <w:abstractNum w:abstractNumId="9" w15:restartNumberingAfterBreak="0">
+  <w:abstractNum w:abstractNumId="10" w15:restartNumberingAfterBreak="0">
     <w:nsid w:val="2D5F475C"/>
     <w:multiLevelType w:val="multilevel"/>
     <w:tmpl w:val="917CF060"/>
@@ -9066,7 +12020,7 @@
       </w:pPr>
     </w:lvl>
   </w:abstractNum>
-  <w:abstractNum w:abstractNumId="10" w15:restartNumberingAfterBreak="0">
+  <w:abstractNum w:abstractNumId="11" w15:restartNumberingAfterBreak="0">
     <w:nsid w:val="30DB04E8"/>
     <w:multiLevelType w:val="multilevel"/>
     <w:tmpl w:val="C99CEEEE"/>
@@ -9215,7 +12169,7 @@
       </w:rPr>
     </w:lvl>
   </w:abstractNum>
-  <w:abstractNum w:abstractNumId="11" w15:restartNumberingAfterBreak="0">
+  <w:abstractNum w:abstractNumId="12" w15:restartNumberingAfterBreak="0">
     <w:nsid w:val="3A76133E"/>
     <w:multiLevelType w:val="multilevel"/>
     <w:tmpl w:val="E1C87850"/>
@@ -9364,7 +12318,7 @@
       </w:rPr>
     </w:lvl>
   </w:abstractNum>
-  <w:abstractNum w:abstractNumId="12" w15:restartNumberingAfterBreak="0">
+  <w:abstractNum w:abstractNumId="13" w15:restartNumberingAfterBreak="0">
     <w:nsid w:val="3CA82648"/>
     <w:multiLevelType w:val="multilevel"/>
     <w:tmpl w:val="8C0AC016"/>
@@ -9513,7 +12467,7 @@
       </w:rPr>
     </w:lvl>
   </w:abstractNum>
-  <w:abstractNum w:abstractNumId="13" w15:restartNumberingAfterBreak="0">
+  <w:abstractNum w:abstractNumId="14" w15:restartNumberingAfterBreak="0">
     <w:nsid w:val="3E063DBF"/>
     <w:multiLevelType w:val="multilevel"/>
     <w:tmpl w:val="21B6C262"/>
@@ -9662,7 +12616,7 @@
       </w:rPr>
     </w:lvl>
   </w:abstractNum>
-  <w:abstractNum w:abstractNumId="14" w15:restartNumberingAfterBreak="0">
+  <w:abstractNum w:abstractNumId="15" w15:restartNumberingAfterBreak="0">
     <w:nsid w:val="402B6C6F"/>
     <w:multiLevelType w:val="multilevel"/>
     <w:tmpl w:val="4E94DEA0"/>
@@ -9811,7 +12765,7 @@
       </w:rPr>
     </w:lvl>
   </w:abstractNum>
-  <w:abstractNum w:abstractNumId="15" w15:restartNumberingAfterBreak="0">
+  <w:abstractNum w:abstractNumId="16" w15:restartNumberingAfterBreak="0">
     <w:nsid w:val="47D04225"/>
     <w:multiLevelType w:val="multilevel"/>
     <w:tmpl w:val="6AE8A4F6"/>
@@ -9960,7 +12914,7 @@
       </w:rPr>
     </w:lvl>
   </w:abstractNum>
-  <w:abstractNum w:abstractNumId="16" w15:restartNumberingAfterBreak="0">
+  <w:abstractNum w:abstractNumId="17" w15:restartNumberingAfterBreak="0">
     <w:nsid w:val="4DD81D82"/>
     <w:multiLevelType w:val="multilevel"/>
     <w:tmpl w:val="69CC2B7A"/>
@@ -10109,7 +13063,7 @@
       </w:rPr>
     </w:lvl>
   </w:abstractNum>
-  <w:abstractNum w:abstractNumId="17" w15:restartNumberingAfterBreak="0">
+  <w:abstractNum w:abstractNumId="18" w15:restartNumberingAfterBreak="0">
     <w:nsid w:val="53C330E3"/>
     <w:multiLevelType w:val="multilevel"/>
     <w:tmpl w:val="57D645FA"/>
@@ -10258,7 +13212,7 @@
       </w:rPr>
     </w:lvl>
   </w:abstractNum>
-  <w:abstractNum w:abstractNumId="18" w15:restartNumberingAfterBreak="0">
+  <w:abstractNum w:abstractNumId="19" w15:restartNumberingAfterBreak="0">
     <w:nsid w:val="551726B5"/>
     <w:multiLevelType w:val="multilevel"/>
     <w:tmpl w:val="42B0EF06"/>
@@ -10407,7 +13361,156 @@
       </w:rPr>
     </w:lvl>
   </w:abstractNum>
-  <w:abstractNum w:abstractNumId="19" w15:restartNumberingAfterBreak="0">
+  <w:abstractNum w:abstractNumId="20" w15:restartNumberingAfterBreak="0">
+    <w:nsid w:val="56694551"/>
+    <w:multiLevelType w:val="multilevel"/>
+    <w:tmpl w:val="E3363158"/>
+    <w:lvl w:ilvl="0">
+      <w:start w:val="1"/>
+      <w:numFmt w:val="bullet"/>
+      <w:lvlText w:val=""/>
+      <w:lvlJc w:val="left"/>
+      <w:pPr>
+        <w:tabs>
+          <w:tab w:val="num" w:pos="720"/>
+        </w:tabs>
+        <w:ind w:left="720" w:hanging="360"/>
+      </w:pPr>
+      <w:rPr>
+        <w:rFonts w:ascii="Symbol" w:hAnsi="Symbol" w:hint="default"/>
+        <w:sz w:val="20"/>
+      </w:rPr>
+    </w:lvl>
+    <w:lvl w:ilvl="1" w:tentative="1">
+      <w:start w:val="1"/>
+      <w:numFmt w:val="bullet"/>
+      <w:lvlText w:val="o"/>
+      <w:lvlJc w:val="left"/>
+      <w:pPr>
+        <w:tabs>
+          <w:tab w:val="num" w:pos="1440"/>
+        </w:tabs>
+        <w:ind w:left="1440" w:hanging="360"/>
+      </w:pPr>
+      <w:rPr>
+        <w:rFonts w:ascii="Courier New" w:hAnsi="Courier New" w:hint="default"/>
+        <w:sz w:val="20"/>
+      </w:rPr>
+    </w:lvl>
+    <w:lvl w:ilvl="2" w:tentative="1">
+      <w:start w:val="1"/>
+      <w:numFmt w:val="bullet"/>
+      <w:lvlText w:val=""/>
+      <w:lvlJc w:val="left"/>
+      <w:pPr>
+        <w:tabs>
+          <w:tab w:val="num" w:pos="2160"/>
+        </w:tabs>
+        <w:ind w:left="2160" w:hanging="360"/>
+      </w:pPr>
+      <w:rPr>
+        <w:rFonts w:ascii="Wingdings" w:hAnsi="Wingdings" w:hint="default"/>
+        <w:sz w:val="20"/>
+      </w:rPr>
+    </w:lvl>
+    <w:lvl w:ilvl="3" w:tentative="1">
+      <w:start w:val="1"/>
+      <w:numFmt w:val="bullet"/>
+      <w:lvlText w:val=""/>
+      <w:lvlJc w:val="left"/>
+      <w:pPr>
+        <w:tabs>
+          <w:tab w:val="num" w:pos="2880"/>
+        </w:tabs>
+        <w:ind w:left="2880" w:hanging="360"/>
+      </w:pPr>
+      <w:rPr>
+        <w:rFonts w:ascii="Wingdings" w:hAnsi="Wingdings" w:hint="default"/>
+        <w:sz w:val="20"/>
+      </w:rPr>
+    </w:lvl>
+    <w:lvl w:ilvl="4" w:tentative="1">
+      <w:start w:val="1"/>
+      <w:numFmt w:val="bullet"/>
+      <w:lvlText w:val=""/>
+      <w:lvlJc w:val="left"/>
+      <w:pPr>
+        <w:tabs>
+          <w:tab w:val="num" w:pos="3600"/>
+        </w:tabs>
+        <w:ind w:left="3600" w:hanging="360"/>
+      </w:pPr>
+      <w:rPr>
+        <w:rFonts w:ascii="Wingdings" w:hAnsi="Wingdings" w:hint="default"/>
+        <w:sz w:val="20"/>
+      </w:rPr>
+    </w:lvl>
+    <w:lvl w:ilvl="5" w:tentative="1">
+      <w:start w:val="1"/>
+      <w:numFmt w:val="bullet"/>
+      <w:lvlText w:val=""/>
+      <w:lvlJc w:val="left"/>
+      <w:pPr>
+        <w:tabs>
+          <w:tab w:val="num" w:pos="4320"/>
+        </w:tabs>
+        <w:ind w:left="4320" w:hanging="360"/>
+      </w:pPr>
+      <w:rPr>
+        <w:rFonts w:ascii="Wingdings" w:hAnsi="Wingdings" w:hint="default"/>
+        <w:sz w:val="20"/>
+      </w:rPr>
+    </w:lvl>
+    <w:lvl w:ilvl="6" w:tentative="1">
+      <w:start w:val="1"/>
+      <w:numFmt w:val="bullet"/>
+      <w:lvlText w:val=""/>
+      <w:lvlJc w:val="left"/>
+      <w:pPr>
+        <w:tabs>
+          <w:tab w:val="num" w:pos="5040"/>
+        </w:tabs>
+        <w:ind w:left="5040" w:hanging="360"/>
+      </w:pPr>
+      <w:rPr>
+        <w:rFonts w:ascii="Wingdings" w:hAnsi="Wingdings" w:hint="default"/>
+        <w:sz w:val="20"/>
+      </w:rPr>
+    </w:lvl>
+    <w:lvl w:ilvl="7" w:tentative="1">
+      <w:start w:val="1"/>
+      <w:numFmt w:val="bullet"/>
+      <w:lvlText w:val=""/>
+      <w:lvlJc w:val="left"/>
+      <w:pPr>
+        <w:tabs>
+          <w:tab w:val="num" w:pos="5760"/>
+        </w:tabs>
+        <w:ind w:left="5760" w:hanging="360"/>
+      </w:pPr>
+      <w:rPr>
+        <w:rFonts w:ascii="Wingdings" w:hAnsi="Wingdings" w:hint="default"/>
+        <w:sz w:val="20"/>
+      </w:rPr>
+    </w:lvl>
+    <w:lvl w:ilvl="8" w:tentative="1">
+      <w:start w:val="1"/>
+      <w:numFmt w:val="bullet"/>
+      <w:lvlText w:val=""/>
+      <w:lvlJc w:val="left"/>
+      <w:pPr>
+        <w:tabs>
+          <w:tab w:val="num" w:pos="6480"/>
+        </w:tabs>
+        <w:ind w:left="6480" w:hanging="360"/>
+      </w:pPr>
+      <w:rPr>
+        <w:rFonts w:ascii="Wingdings" w:hAnsi="Wingdings" w:hint="default"/>
+        <w:sz w:val="20"/>
+      </w:rPr>
+    </w:lvl>
+  </w:abstractNum>
+  <w:abstractNum w:abstractNumId="21" w15:restartNumberingAfterBreak="0">
     <w:nsid w:val="599E3CB5"/>
     <w:multiLevelType w:val="multilevel"/>
     <w:tmpl w:val="33FA60D0"/>
@@ -10556,7 +13659,7 @@
       </w:rPr>
     </w:lvl>
   </w:abstractNum>
-  <w:abstractNum w:abstractNumId="20" w15:restartNumberingAfterBreak="0">
+  <w:abstractNum w:abstractNumId="22" w15:restartNumberingAfterBreak="0">
     <w:nsid w:val="5CDB19EA"/>
     <w:multiLevelType w:val="multilevel"/>
     <w:tmpl w:val="D73E05BC"/>
@@ -10705,7 +13808,7 @@
       </w:rPr>
     </w:lvl>
   </w:abstractNum>
-  <w:abstractNum w:abstractNumId="21" w15:restartNumberingAfterBreak="0">
+  <w:abstractNum w:abstractNumId="23" w15:restartNumberingAfterBreak="0">
     <w:nsid w:val="5D5A019B"/>
     <w:multiLevelType w:val="multilevel"/>
     <w:tmpl w:val="6FF45628"/>
@@ -10854,7 +13957,7 @@
       </w:rPr>
     </w:lvl>
   </w:abstractNum>
-  <w:abstractNum w:abstractNumId="22" w15:restartNumberingAfterBreak="0">
+  <w:abstractNum w:abstractNumId="24" w15:restartNumberingAfterBreak="0">
     <w:nsid w:val="600163E9"/>
     <w:multiLevelType w:val="multilevel"/>
     <w:tmpl w:val="3C1A33CA"/>
@@ -11003,7 +14106,7 @@
       </w:rPr>
     </w:lvl>
   </w:abstractNum>
-  <w:abstractNum w:abstractNumId="23" w15:restartNumberingAfterBreak="0">
+  <w:abstractNum w:abstractNumId="25" w15:restartNumberingAfterBreak="0">
     <w:nsid w:val="6DF52462"/>
     <w:multiLevelType w:val="multilevel"/>
     <w:tmpl w:val="095C8372"/>
@@ -11153,76 +14256,82 @@
     </w:lvl>
   </w:abstractNum>
   <w:num w:numId="1" w16cid:durableId="333414177">
+    <w:abstractNumId w:val="15"/>
+  </w:num>
+  <w:num w:numId="2" w16cid:durableId="1231161333">
+    <w:abstractNumId w:val="13"/>
+  </w:num>
+  <w:num w:numId="3" w16cid:durableId="502667202">
+    <w:abstractNumId w:val="24"/>
+  </w:num>
+  <w:num w:numId="4" w16cid:durableId="434912221">
+    <w:abstractNumId w:val="5"/>
+  </w:num>
+  <w:num w:numId="5" w16cid:durableId="1651865513">
     <w:abstractNumId w:val="14"/>
   </w:num>
-  <w:num w:numId="2" w16cid:durableId="1231161333">
-    <w:abstractNumId w:val="12"/>
-  </w:num>
-  <w:num w:numId="3" w16cid:durableId="502667202">
-    <w:abstractNumId w:val="22"/>
-  </w:num>
-  <w:num w:numId="4" w16cid:durableId="434912221">
+  <w:num w:numId="6" w16cid:durableId="1797482785">
     <w:abstractNumId w:val="4"/>
   </w:num>
-  <w:num w:numId="5" w16cid:durableId="1651865513">
-    <w:abstractNumId w:val="13"/>
-  </w:num>
-  <w:num w:numId="6" w16cid:durableId="1797482785">
-    <w:abstractNumId w:val="3"/>
-  </w:num>
   <w:num w:numId="7" w16cid:durableId="481774380">
-    <w:abstractNumId w:val="23"/>
+    <w:abstractNumId w:val="25"/>
   </w:num>
   <w:num w:numId="8" w16cid:durableId="1797599499">
-    <w:abstractNumId w:val="5"/>
+    <w:abstractNumId w:val="6"/>
   </w:num>
   <w:num w:numId="9" w16cid:durableId="1443694585">
-    <w:abstractNumId w:val="10"/>
+    <w:abstractNumId w:val="11"/>
   </w:num>
   <w:num w:numId="10" w16cid:durableId="1521161634">
     <w:abstractNumId w:val="0"/>
   </w:num>
   <w:num w:numId="11" w16cid:durableId="46532453">
+    <w:abstractNumId w:val="9"/>
+  </w:num>
+  <w:num w:numId="12" w16cid:durableId="1944415592">
+    <w:abstractNumId w:val="18"/>
+  </w:num>
+  <w:num w:numId="13" w16cid:durableId="933637356">
+    <w:abstractNumId w:val="22"/>
+  </w:num>
+  <w:num w:numId="14" w16cid:durableId="279184667">
+    <w:abstractNumId w:val="12"/>
+  </w:num>
+  <w:num w:numId="15" w16cid:durableId="1098915375">
+    <w:abstractNumId w:val="2"/>
+  </w:num>
+  <w:num w:numId="16" w16cid:durableId="1268347540">
+    <w:abstractNumId w:val="21"/>
+  </w:num>
+  <w:num w:numId="17" w16cid:durableId="1217397133">
+    <w:abstractNumId w:val="23"/>
+  </w:num>
+  <w:num w:numId="18" w16cid:durableId="1081486797">
+    <w:abstractNumId w:val="19"/>
+  </w:num>
+  <w:num w:numId="19" w16cid:durableId="377511369">
+    <w:abstractNumId w:val="17"/>
+  </w:num>
+  <w:num w:numId="20" w16cid:durableId="226763448">
+    <w:abstractNumId w:val="10"/>
+  </w:num>
+  <w:num w:numId="21" w16cid:durableId="240331815">
+    <w:abstractNumId w:val="7"/>
+  </w:num>
+  <w:num w:numId="22" w16cid:durableId="508447604">
+    <w:abstractNumId w:val="3"/>
+  </w:num>
+  <w:num w:numId="23" w16cid:durableId="2119329663">
     <w:abstractNumId w:val="8"/>
   </w:num>
-  <w:num w:numId="12" w16cid:durableId="1944415592">
-    <w:abstractNumId w:val="17"/>
+  <w:num w:numId="24" w16cid:durableId="1893275433">
+    <w:abstractNumId w:val="16"/>
   </w:num>
-  <w:num w:numId="13" w16cid:durableId="933637356">
-    <w:abstractNumId w:val="20"/>
-  </w:num>
-  <w:num w:numId="14" w16cid:durableId="279184667">
-    <w:abstractNumId w:val="11"/>
-  </w:num>
-  <w:num w:numId="15" w16cid:durableId="1098915375">
+  <w:num w:numId="25" w16cid:durableId="1904755587">
     <w:abstractNumId w:val="1"/>
   </w:num>
-  <w:num w:numId="16" w16cid:durableId="1268347540">
-    <w:abstractNumId w:val="19"/>
-  </w:num>
-  <w:num w:numId="17" w16cid:durableId="1217397133">
-    <w:abstractNumId w:val="21"/>
-  </w:num>
-  <w:num w:numId="18" w16cid:durableId="1081486797">
-    <w:abstractNumId w:val="18"/>
-  </w:num>
-  <w:num w:numId="19" w16cid:durableId="377511369">
-    <w:abstractNumId w:val="16"/>
-  </w:num>
-  <w:num w:numId="20" w16cid:durableId="226763448">
-    <w:abstractNumId w:val="9"/>
-  </w:num>
-  <w:num w:numId="21" w16cid:durableId="240331815">
-    <w:abstractNumId w:val="6"/>
-  </w:num>
-  <w:num w:numId="22" w16cid:durableId="508447604">
-    <w:abstractNumId w:val="2"/>
-  </w:num>
-  <w:num w:numId="23" w16cid:durableId="2119329663">
-    <w:abstractNumId w:val="7"/>
-  </w:num>
-  <w:num w:numId="24" w16cid:durableId="1893275433">
-    <w:abstractNumId w:val="15"/>
+  <w:num w:numId="26" w16cid:durableId="1167284865">
+    <w:abstractNumId w:val="20"/>
   </w:num>
 </w:numbering>
 </file>
@@ -11674,6 +14783,7 @@
   <w:style w:type="character" w:default="1" w:styleId="DefaultParagraphFont">
     <w:name w:val="Default Paragraph Font"/>
     <w:uiPriority w:val="1"/>
+    <w:semiHidden/>
     <w:unhideWhenUsed/>
   </w:style>
   <w:style w:type="table" w:default="1" w:styleId="TableNormal">
@@ -11793,6 +14903,75 @@
       <w:szCs w:val="24"/>
       <w:lang w:val="en-CA" w:eastAsia="en-CA"/>
       <w14:ligatures w14:val="none"/>
+    </w:rPr>
+  </w:style>
+  <w:style w:type="paragraph" w:styleId="ListParagraph">
+    <w:name w:val="List Paragraph"/>
+    <w:basedOn w:val="Normal"/>
+    <w:uiPriority w:val="34"/>
+    <w:qFormat/>
+    <w:rsid w:val="00827675"/>
+    <w:pPr>
+      <w:ind w:left="720"/>
+      <w:contextualSpacing/>
+    </w:pPr>
+  </w:style>
+  <w:style w:type="table" w:styleId="TableGrid">
+    <w:name w:val="Table Grid"/>
+    <w:basedOn w:val="TableNormal"/>
+    <w:uiPriority w:val="39"/>
+    <w:rsid w:val="00827675"/>
+    <w:pPr>
+      <w:spacing w:after="0" w:line="240" w:lineRule="auto"/>
+    </w:pPr>
+    <w:tblPr>
+      <w:tblBorders>
+        <w:top w:val="single" w:sz="4" w:space="0" w:color="auto"/>
+        <w:left w:val="single" w:sz="4" w:space="0" w:color="auto"/>
+        <w:bottom w:val="single" w:sz="4" w:space="0" w:color="auto"/>
+        <w:right w:val="single" w:sz="4" w:space="0" w:color="auto"/>
+        <w:insideH w:val="single" w:sz="4" w:space="0" w:color="auto"/>
+        <w:insideV w:val="single" w:sz="4" w:space="0" w:color="auto"/>
+      </w:tblBorders>
+    </w:tblPr>
+  </w:style>
+  <w:style w:type="paragraph" w:styleId="EndnoteText">
+    <w:name w:val="endnote text"/>
+    <w:basedOn w:val="Normal"/>
+    <w:link w:val="EndnoteTextChar"/>
+    <w:uiPriority w:val="99"/>
+    <w:semiHidden/>
+    <w:unhideWhenUsed/>
+    <w:rsid w:val="00952A59"/>
+    <w:pPr>
+      <w:spacing w:after="0" w:line="240" w:lineRule="auto"/>
+    </w:pPr>
+    <w:rPr>
+      <w:sz w:val="20"/>
+      <w:szCs w:val="20"/>
+    </w:rPr>
+  </w:style>
+  <w:style w:type="character" w:customStyle="1" w:styleId="EndnoteTextChar">
+    <w:name w:val="Endnote Text Char"/>
+    <w:basedOn w:val="DefaultParagraphFont"/>
+    <w:link w:val="EndnoteText"/>
+    <w:uiPriority w:val="99"/>
+    <w:semiHidden/>
+    <w:rsid w:val="00952A59"/>
+    <w:rPr>
+      <w:sz w:val="20"/>
+      <w:szCs w:val="20"/>
+    </w:rPr>
+  </w:style>
+  <w:style w:type="character" w:styleId="EndnoteReference">
+    <w:name w:val="endnote reference"/>
+    <w:basedOn w:val="DefaultParagraphFont"/>
+    <w:uiPriority w:val="99"/>
+    <w:semiHidden/>
+    <w:unhideWhenUsed/>
+    <w:rsid w:val="00952A59"/>
+    <w:rPr>
+      <w:vertAlign w:val="superscript"/>
     </w:rPr>
   </w:style>
 </w:styles>

</xml_diff>